<commit_message>
includes verbose project pages
</commit_message>
<xml_diff>
--- a/assets/docs/cv_Skye2025.docx
+++ b/assets/docs/cv_Skye2025.docx
@@ -13,19 +13,7 @@
         <w:rPr>
           <w:rFonts w:asciiTheme="minorHAnsi" w:hAnsiTheme="minorHAnsi" w:cstheme="minorHAnsi"/>
         </w:rPr>
-        <w:t xml:space="preserve">Jax </w:t>
-      </w:r>
-      <w:r>
-        <w:rPr>
-          <w:rFonts w:asciiTheme="minorHAnsi" w:hAnsiTheme="minorHAnsi" w:cstheme="minorHAnsi"/>
-        </w:rPr>
-        <w:t xml:space="preserve">D. </w:t>
-      </w:r>
-      <w:r>
-        <w:rPr>
-          <w:rFonts w:asciiTheme="minorHAnsi" w:hAnsiTheme="minorHAnsi" w:cstheme="minorHAnsi"/>
-        </w:rPr>
-        <w:t>Skye</w:t>
+        <w:t>Jax Skye</w:t>
       </w:r>
       <w:r>
         <w:rPr>
@@ -56,8 +44,8 @@
         <w:tblLook w:val="01E0" w:firstRow="1" w:lastRow="1" w:firstColumn="1" w:lastColumn="1" w:noHBand="0" w:noVBand="0"/>
       </w:tblPr>
       <w:tblGrid>
-        <w:gridCol w:w="5833"/>
-        <w:gridCol w:w="5036"/>
+        <w:gridCol w:w="5831"/>
+        <w:gridCol w:w="5038"/>
       </w:tblGrid>
       <w:tr>
         <w:trPr>
@@ -152,7 +140,31 @@
               <w:rPr>
                 <w:rFonts w:asciiTheme="minorHAnsi" w:hAnsiTheme="minorHAnsi" w:cstheme="minorHAnsi"/>
               </w:rPr>
-              <w:t>Email: jax-skye@uiowa.edu</w:t>
+              <w:t xml:space="preserve">Email: </w:t>
+            </w:r>
+            <w:hyperlink r:id="rId11" w:history="1">
+              <w:r>
+                <w:rPr>
+                  <w:rStyle w:val="Hyperlink"/>
+                  <w:rFonts w:asciiTheme="minorHAnsi" w:hAnsiTheme="minorHAnsi" w:cstheme="minorHAnsi"/>
+                </w:rPr>
+                <w:t>jax-skye@uiowa.edu</w:t>
+              </w:r>
+            </w:hyperlink>
+          </w:p>
+          <w:p>
+            <w:pPr>
+              <w:widowControl w:val="0"/>
+              <w:jc w:val="right"/>
+              <w:rPr>
+                <w:rFonts w:asciiTheme="minorHAnsi" w:hAnsiTheme="minorHAnsi" w:cstheme="minorHAnsi"/>
+              </w:rPr>
+            </w:pPr>
+            <w:r>
+              <w:rPr>
+                <w:rFonts w:asciiTheme="minorHAnsi" w:hAnsiTheme="minorHAnsi" w:cstheme="minorHAnsi"/>
+              </w:rPr>
+              <w:t>www.jaxskye.com</w:t>
             </w:r>
           </w:p>
         </w:tc>
@@ -865,6 +877,7 @@
           <w:rFonts w:asciiTheme="minorHAnsi" w:hAnsiTheme="minorHAnsi" w:cstheme="minorBidi"/>
         </w:rPr>
       </w:pPr>
+      <w:commentRangeStart w:id="0"/>
       <w:r>
         <w:rPr>
           <w:rFonts w:asciiTheme="minorHAnsi" w:hAnsiTheme="minorHAnsi" w:cstheme="minorBidi"/>
@@ -933,6 +946,16 @@
           <w:rFonts w:asciiTheme="minorHAnsi" w:hAnsiTheme="minorHAnsi" w:cstheme="minorBidi"/>
         </w:rPr>
         <w:t>, Psychiatry &amp; Psychological and Brain Sciences</w:t>
+      </w:r>
+      <w:commentRangeEnd w:id="0"/>
+      <w:r>
+        <w:rPr>
+          <w:rStyle w:val="CommentReference"/>
+          <w:rFonts w:asciiTheme="minorHAnsi" w:hAnsiTheme="minorHAnsi" w:cstheme="minorBidi"/>
+          <w:sz w:val="24"/>
+          <w:szCs w:val="24"/>
+        </w:rPr>
+        <w:commentReference w:id="0"/>
       </w:r>
     </w:p>
     <w:p>
@@ -995,31 +1018,31 @@
         <w:rPr>
           <w:rFonts w:asciiTheme="minorHAnsi" w:hAnsiTheme="minorHAnsi" w:cstheme="minorBidi"/>
         </w:rPr>
-        <w:t xml:space="preserve">Developed predictive models </w:t>
+        <w:t xml:space="preserve">Developed </w:t>
       </w:r>
       <w:r>
         <w:rPr>
           <w:rFonts w:asciiTheme="minorHAnsi" w:hAnsiTheme="minorHAnsi" w:cstheme="minorBidi"/>
         </w:rPr>
-        <w:t>of</w:t>
+        <w:t>two open-source Python toolboxes (stroke outcome prediction</w:t>
       </w:r>
       <w:r>
         <w:rPr>
           <w:rFonts w:asciiTheme="minorHAnsi" w:hAnsiTheme="minorHAnsi" w:cstheme="minorBidi"/>
         </w:rPr>
-        <w:t xml:space="preserve"> longitudinal stroke outcomes </w:t>
+        <w:t xml:space="preserve"> using nonlinear low-dimensional embeddings</w:t>
       </w:r>
       <w:r>
         <w:rPr>
           <w:rFonts w:asciiTheme="minorHAnsi" w:hAnsiTheme="minorHAnsi" w:cstheme="minorBidi"/>
         </w:rPr>
-        <w:t>using</w:t>
+        <w:t xml:space="preserve"> </w:t>
       </w:r>
       <w:r>
         <w:rPr>
           <w:rFonts w:asciiTheme="minorHAnsi" w:hAnsiTheme="minorHAnsi" w:cstheme="minorBidi"/>
         </w:rPr>
-        <w:t xml:space="preserve"> low-dimensional embeddings</w:t>
+        <w:t>and topological data analysis of brain lesion patient data)</w:t>
       </w:r>
     </w:p>
     <w:p>
@@ -1037,37 +1060,7 @@
         <w:rPr>
           <w:rFonts w:asciiTheme="minorHAnsi" w:hAnsiTheme="minorHAnsi" w:cstheme="minorBidi"/>
         </w:rPr>
-        <w:t xml:space="preserve">Identified </w:t>
-      </w:r>
-      <w:r>
-        <w:rPr>
-          <w:rFonts w:asciiTheme="minorHAnsi" w:hAnsiTheme="minorHAnsi" w:cstheme="minorBidi"/>
-        </w:rPr>
-        <w:t xml:space="preserve">lesion locations associated with </w:t>
-      </w:r>
-      <w:r>
-        <w:rPr>
-          <w:rFonts w:asciiTheme="minorHAnsi" w:hAnsiTheme="minorHAnsi" w:cstheme="minorBidi"/>
-        </w:rPr>
-        <w:t xml:space="preserve">socially inappropriate behavior following </w:t>
-      </w:r>
-      <w:r>
-        <w:rPr>
-          <w:rFonts w:asciiTheme="minorHAnsi" w:hAnsiTheme="minorHAnsi" w:cstheme="minorBidi"/>
-        </w:rPr>
-        <w:t xml:space="preserve">focal </w:t>
-      </w:r>
-      <w:r>
-        <w:rPr>
-          <w:rFonts w:asciiTheme="minorHAnsi" w:hAnsiTheme="minorHAnsi" w:cstheme="minorBidi"/>
-        </w:rPr>
-        <w:t xml:space="preserve">brain </w:t>
-      </w:r>
-      <w:r>
-        <w:rPr>
-          <w:rFonts w:asciiTheme="minorHAnsi" w:hAnsiTheme="minorHAnsi" w:cstheme="minorBidi"/>
-        </w:rPr>
-        <w:t>damage</w:t>
+        <w:t>Identified relationships between brain network disruption due to brain lesion and social behavior change</w:t>
       </w:r>
     </w:p>
     <w:p>
@@ -1445,25 +1438,13 @@
         <w:rPr>
           <w:rFonts w:asciiTheme="minorHAnsi" w:hAnsiTheme="minorHAnsi" w:cstheme="minorBidi"/>
         </w:rPr>
-        <w:t>In</w:t>
+        <w:t xml:space="preserve">Investigated the relationship between brain lesion location and </w:t>
       </w:r>
       <w:r>
         <w:rPr>
           <w:rFonts w:asciiTheme="minorHAnsi" w:hAnsiTheme="minorHAnsi" w:cstheme="minorBidi"/>
         </w:rPr>
-        <w:t>vestigated</w:t>
-      </w:r>
-      <w:r>
-        <w:rPr>
-          <w:rFonts w:asciiTheme="minorHAnsi" w:hAnsiTheme="minorHAnsi" w:cstheme="minorBidi"/>
-        </w:rPr>
-        <w:t xml:space="preserve"> brain</w:t>
-      </w:r>
-      <w:r>
-        <w:rPr>
-          <w:rFonts w:asciiTheme="minorHAnsi" w:hAnsiTheme="minorHAnsi" w:cstheme="minorBidi"/>
-        </w:rPr>
-        <w:t xml:space="preserve"> lesion locations associated with domain-general cognitive impairment</w:t>
+        <w:t>domain-general cognitive impairment</w:t>
       </w:r>
       <w:r>
         <w:rPr>
@@ -1665,7 +1646,19 @@
         <w:rPr>
           <w:rFonts w:asciiTheme="minorHAnsi" w:hAnsiTheme="minorHAnsi" w:cstheme="minorBidi"/>
         </w:rPr>
-        <w:t>Projects studying the neural correlates of time perception, visuospatial perception, and cerebellar mutism syndrome in patients with focal brain damage</w:t>
+        <w:t xml:space="preserve">Projects </w:t>
+      </w:r>
+      <w:r>
+        <w:rPr>
+          <w:rFonts w:asciiTheme="minorHAnsi" w:hAnsiTheme="minorHAnsi" w:cstheme="minorBidi"/>
+        </w:rPr>
+        <w:t>investigateing</w:t>
+      </w:r>
+      <w:r>
+        <w:rPr>
+          <w:rFonts w:asciiTheme="minorHAnsi" w:hAnsiTheme="minorHAnsi" w:cstheme="minorBidi"/>
+        </w:rPr>
+        <w:t xml:space="preserve"> the neural correlates of time perception, visuospatial perception, and cerebellar mutism syndrome in patients with focal brain damage</w:t>
       </w:r>
     </w:p>
     <w:p>
@@ -1713,6 +1706,7 @@
         <w:rPr>
           <w:rFonts w:asciiTheme="minorHAnsi" w:hAnsiTheme="minorHAnsi" w:cstheme="minorBidi"/>
         </w:rPr>
+        <w:lastRenderedPageBreak/>
         <w:t>Collaborated with Wadsworth lab overseeing data collection for neuropsychological test of visuospatial ability in healthy adults</w:t>
       </w:r>
     </w:p>
@@ -1734,7 +1728,6 @@
           <w:rFonts w:asciiTheme="minorHAnsi" w:hAnsiTheme="minorHAnsi" w:cstheme="minorBidi"/>
           <w:i/>
         </w:rPr>
-        <w:lastRenderedPageBreak/>
         <w:t>Undergraduate students advised</w:t>
       </w:r>
       <w:r>
@@ -2936,7 +2929,7 @@
           <w:rFonts w:asciiTheme="minorHAnsi" w:hAnsiTheme="minorHAnsi" w:cstheme="minorHAnsi"/>
         </w:rPr>
       </w:pPr>
-      <w:bookmarkStart w:id="0" w:name="_Hlk130995546"/>
+      <w:bookmarkStart w:id="1" w:name="_Hlk130995546"/>
       <w:r>
         <w:rPr>
           <w:rFonts w:asciiTheme="minorHAnsi" w:hAnsiTheme="minorHAnsi" w:cstheme="minorHAnsi"/>
@@ -3057,7 +3050,7 @@
         <w:t>Awarded to neuroscience graduate student with the best Research Day poster</w:t>
       </w:r>
     </w:p>
-    <w:bookmarkEnd w:id="0"/>
+    <w:bookmarkEnd w:id="1"/>
     <w:p>
       <w:pPr>
         <w:tabs>
@@ -3655,7 +3648,6 @@
         <w:rPr>
           <w:rFonts w:asciiTheme="minorHAnsi" w:hAnsiTheme="minorHAnsi" w:cstheme="minorHAnsi"/>
         </w:rPr>
-        <w:lastRenderedPageBreak/>
         <w:t>Scholarships</w:t>
       </w:r>
     </w:p>
@@ -4326,7 +4318,7 @@
         </w:rPr>
         <w:t xml:space="preserve"> </w:t>
       </w:r>
-      <w:hyperlink r:id="rId11" w:history="1">
+      <w:hyperlink r:id="rId15" w:history="1">
         <w:r>
           <w:rPr>
             <w:rStyle w:val="Hyperlink"/>
@@ -4442,7 +4434,7 @@
         </w:rPr>
         <w:t xml:space="preserve"> </w:t>
       </w:r>
-      <w:hyperlink r:id="rId12" w:history="1">
+      <w:hyperlink r:id="rId16" w:history="1">
         <w:r>
           <w:rPr>
             <w:rStyle w:val="Hyperlink"/>
@@ -4505,8 +4497,8 @@
         </w:rPr>
         <w:t>With Abstracts</w:t>
       </w:r>
-      <w:bookmarkStart w:id="1" w:name="_Hlk124457337"/>
-      <w:bookmarkStart w:id="2" w:name="_Hlk130995596"/>
+      <w:bookmarkStart w:id="2" w:name="_Hlk124457337"/>
+      <w:bookmarkStart w:id="3" w:name="_Hlk130995596"/>
     </w:p>
     <w:p>
       <w:pPr>
@@ -4521,56 +4513,16 @@
       <w:r>
         <w:rPr>
           <w:rStyle w:val="normaltextrun"/>
-        </w:rPr>
-        <w:t>Skye, J., Boes., AD., Kliemann, D., &amp; Traer, JA. “</w:t>
-      </w:r>
-      <w:r>
-        <w:rPr>
-          <w:rStyle w:val="normaltextrun"/>
-        </w:rPr>
-        <w:t xml:space="preserve">Predicting Stroke Recovery with </w:t>
-      </w:r>
-      <w:r>
-        <w:rPr>
-          <w:rStyle w:val="normaltextrun"/>
-        </w:rPr>
-        <w:t>Nonlinear Low-Dimensional Embeddings of Behavioral Profiles</w:t>
-      </w:r>
-      <w:r>
-        <w:rPr>
-          <w:rStyle w:val="normaltextrun"/>
-        </w:rPr>
-        <w:t>,” Co</w:t>
-      </w:r>
-      <w:r>
-        <w:rPr>
-          <w:rStyle w:val="normaltextrun"/>
-        </w:rPr>
-        <w:t>gnitive Computational Neuroscience</w:t>
-      </w:r>
-      <w:r>
-        <w:rPr>
-          <w:rStyle w:val="normaltextrun"/>
-        </w:rPr>
-        <w:t xml:space="preserve">, August, 2025, </w:t>
-      </w:r>
-      <w:r>
-        <w:rPr>
-          <w:rStyle w:val="normaltextrun"/>
-        </w:rPr>
-        <w:t>Amsterdam, NL</w:t>
-      </w:r>
-      <w:r>
-        <w:rPr>
-          <w:rStyle w:val="normaltextrun"/>
-        </w:rPr>
-        <w:t>.</w:t>
-      </w:r>
-      <w:r>
-        <w:rPr>
-          <w:rStyle w:val="normaltextrun"/>
-        </w:rPr>
-        <w:t xml:space="preserve"> (</w:t>
+          <w:b/>
+          <w:bCs/>
+        </w:rPr>
+        <w:t>Skye, J.</w:t>
+      </w:r>
+      <w:r>
+        <w:rPr>
+          <w:rStyle w:val="normaltextrun"/>
+        </w:rPr>
+        <w:t>, Boes., AD., Tranel, D., Traer, JA., &amp; Kliemann, D. “Lesion-deficit mapping of social behavior change following focal brain lesions,” Organization for Human Brain Mapping, June 2026, Bordeaux, FR. (</w:t>
       </w:r>
       <w:r>
         <w:rPr>
@@ -4578,15 +4530,7 @@
           <w:i/>
           <w:iCs/>
         </w:rPr>
-        <w:t>also presented at Society for Neuroscience 2025</w:t>
-      </w:r>
-      <w:r>
-        <w:rPr>
-          <w:rStyle w:val="normaltextrun"/>
-          <w:i/>
-          <w:iCs/>
-        </w:rPr>
-        <w:t xml:space="preserve"> and UIowa Neuroscience Graduate Program Recruitment Weekend</w:t>
+        <w:t>accepted, to be presented in June 2026</w:t>
       </w:r>
       <w:r>
         <w:rPr>
@@ -4608,26 +4552,86 @@
       <w:r>
         <w:rPr>
           <w:rStyle w:val="normaltextrun"/>
-        </w:rPr>
-        <w:t xml:space="preserve">Skye, J., Boes., AD., Kliemann, D., </w:t>
-      </w:r>
-      <w:r>
-        <w:rPr>
-          <w:rStyle w:val="normaltextrun"/>
-        </w:rPr>
-        <w:t xml:space="preserve">&amp; Traer, JA. </w:t>
-      </w:r>
-      <w:r>
-        <w:rPr>
-          <w:rStyle w:val="normaltextrun"/>
-        </w:rPr>
-        <w:t xml:space="preserve">“Nonlinear Low Dimensional Embeddings Predict Stroke Functional Outcomes,” Computational Psychiatry Symposium, </w:t>
-      </w:r>
-      <w:r>
-        <w:rPr>
-          <w:rStyle w:val="normaltextrun"/>
-        </w:rPr>
-        <w:t>April, 2025, Iowa City, IA.</w:t>
+          <w:b/>
+          <w:bCs/>
+        </w:rPr>
+        <w:t>Skye, J.</w:t>
+      </w:r>
+      <w:r>
+        <w:rPr>
+          <w:rStyle w:val="normaltextrun"/>
+        </w:rPr>
+        <w:t>, Boes., AD., Kliemann, D., &amp; Traer, JA. “</w:t>
+      </w:r>
+      <w:r>
+        <w:rPr>
+          <w:rStyle w:val="normaltextrun"/>
+        </w:rPr>
+        <w:t xml:space="preserve">Predicting Stroke Recovery with </w:t>
+      </w:r>
+      <w:r>
+        <w:rPr>
+          <w:rStyle w:val="normaltextrun"/>
+        </w:rPr>
+        <w:t>Nonlinear Low-Dimensional Embeddings of Behavioral Profiles</w:t>
+      </w:r>
+      <w:r>
+        <w:rPr>
+          <w:rStyle w:val="normaltextrun"/>
+        </w:rPr>
+        <w:t>,” Co</w:t>
+      </w:r>
+      <w:r>
+        <w:rPr>
+          <w:rStyle w:val="normaltextrun"/>
+        </w:rPr>
+        <w:t>gnitive Computational Neuroscience</w:t>
+      </w:r>
+      <w:r>
+        <w:rPr>
+          <w:rStyle w:val="normaltextrun"/>
+        </w:rPr>
+        <w:t xml:space="preserve">, August, 2025, </w:t>
+      </w:r>
+      <w:r>
+        <w:rPr>
+          <w:rStyle w:val="normaltextrun"/>
+        </w:rPr>
+        <w:t>Amsterdam, NL</w:t>
+      </w:r>
+      <w:r>
+        <w:rPr>
+          <w:rStyle w:val="normaltextrun"/>
+        </w:rPr>
+        <w:t>.</w:t>
+      </w:r>
+      <w:r>
+        <w:rPr>
+          <w:rStyle w:val="normaltextrun"/>
+        </w:rPr>
+        <w:t xml:space="preserve"> (</w:t>
+      </w:r>
+      <w:r>
+        <w:rPr>
+          <w:rStyle w:val="normaltextrun"/>
+          <w:i/>
+          <w:iCs/>
+        </w:rPr>
+        <w:t>also presented at Society for Neuroscience 2025</w:t>
+      </w:r>
+      <w:r>
+        <w:rPr>
+          <w:rStyle w:val="normaltextrun"/>
+          <w:i/>
+          <w:iCs/>
+        </w:rPr>
+        <w:t xml:space="preserve"> and UIowa Neuroscience Graduate Program Recruitment Weekend</w:t>
+      </w:r>
+      <w:r>
+        <w:rPr>
+          <w:rStyle w:val="normaltextrun"/>
+        </w:rPr>
+        <w:t>)</w:t>
       </w:r>
     </w:p>
     <w:p>
@@ -4636,19 +4640,10 @@
         <w:spacing w:before="0" w:beforeAutospacing="0" w:after="0" w:afterAutospacing="0"/>
         <w:ind w:left="720" w:hanging="720"/>
         <w:textAlignment w:val="baseline"/>
-      </w:pPr>
-      <w:r>
-        <w:rPr>
-          <w:rStyle w:val="normaltextrun"/>
-        </w:rPr>
-        <w:t xml:space="preserve">Deifelt Streese, C., </w:t>
-      </w:r>
-      <w:r>
-        <w:rPr>
-          <w:rStyle w:val="normaltextrun"/>
-        </w:rPr>
-        <w:t xml:space="preserve">Ogden, K., Bruss, J., </w:t>
-      </w:r>
+        <w:rPr>
+          <w:rStyle w:val="normaltextrun"/>
+        </w:rPr>
+      </w:pPr>
       <w:r>
         <w:rPr>
           <w:rStyle w:val="normaltextrun"/>
@@ -4661,31 +4656,25 @@
         <w:rPr>
           <w:rStyle w:val="normaltextrun"/>
         </w:rPr>
-        <w:t xml:space="preserve">, </w:t>
-      </w:r>
-      <w:r>
-        <w:rPr>
-          <w:rStyle w:val="normaltextrun"/>
-        </w:rPr>
-        <w:t>Michaelson, J., &amp;</w:t>
-      </w:r>
-      <w:r>
-        <w:rPr>
-          <w:rStyle w:val="normaltextrun"/>
-        </w:rPr>
-        <w:t xml:space="preserve"> Tranel, D., “</w:t>
-      </w:r>
-      <w:r>
-        <w:rPr>
-          <w:rStyle w:val="normaltextrun"/>
-        </w:rPr>
-        <w:t>Neuroanatomical correlates of response patters in a measure of phonemic verbal fluency by participants with focal brain injury</w:t>
-      </w:r>
-      <w:r>
-        <w:rPr>
-          <w:rStyle w:val="normaltextrun"/>
-        </w:rPr>
-        <w:t>,” Society for Neuroscience Annual Meeting, Oct., 2024, Chicago, IL.</w:t>
+        <w:t xml:space="preserve">, Boes., AD., Kliemann, D., </w:t>
+      </w:r>
+      <w:r>
+        <w:rPr>
+          <w:rStyle w:val="normaltextrun"/>
+        </w:rPr>
+        <w:t xml:space="preserve">&amp; Traer, JA. </w:t>
+      </w:r>
+      <w:r>
+        <w:rPr>
+          <w:rStyle w:val="normaltextrun"/>
+        </w:rPr>
+        <w:t xml:space="preserve">“Nonlinear Low Dimensional Embeddings Predict Stroke Functional Outcomes,” Computational Psychiatry Symposium, </w:t>
+      </w:r>
+      <w:r>
+        <w:rPr>
+          <w:rStyle w:val="normaltextrun"/>
+        </w:rPr>
+        <w:t>April, 2025, Iowa City, IA.</w:t>
       </w:r>
     </w:p>
     <w:p>
@@ -4694,29 +4683,18 @@
         <w:spacing w:before="0" w:beforeAutospacing="0" w:after="0" w:afterAutospacing="0"/>
         <w:ind w:left="720" w:hanging="720"/>
         <w:textAlignment w:val="baseline"/>
-        <w:rPr>
-          <w:rStyle w:val="normaltextrun"/>
-        </w:rPr>
-      </w:pPr>
-      <w:r>
-        <w:rPr>
-          <w:rStyle w:val="normaltextrun"/>
-        </w:rPr>
-        <w:t>McNichol, B., Bowren, M., Langbehn, K.</w:t>
-      </w:r>
-      <w:r>
-        <w:rPr>
-          <w:rStyle w:val="normaltextrun"/>
-        </w:rPr>
-        <w:t>,</w:t>
-      </w:r>
-      <w:r>
-        <w:rPr>
-          <w:rStyle w:val="normaltextrun"/>
-          <w:b/>
-          <w:bCs/>
-        </w:rPr>
-        <w:t xml:space="preserve"> </w:t>
+      </w:pPr>
+      <w:r>
+        <w:rPr>
+          <w:rStyle w:val="normaltextrun"/>
+        </w:rPr>
+        <w:t xml:space="preserve">Deifelt Streese, C., </w:t>
+      </w:r>
+      <w:r>
+        <w:rPr>
+          <w:rStyle w:val="normaltextrun"/>
+        </w:rPr>
+        <w:t xml:space="preserve">Ogden, K., Bruss, J., </w:t>
       </w:r>
       <w:r>
         <w:rPr>
@@ -4733,34 +4711,28 @@
         <w:t xml:space="preserve">, </w:t>
       </w:r>
       <w:r>
-        <w:t xml:space="preserve">Boes, AD., </w:t>
-      </w:r>
-      <w:r>
-        <w:t xml:space="preserve">&amp; </w:t>
-      </w:r>
-      <w:r>
-        <w:rPr>
-          <w:rStyle w:val="normaltextrun"/>
-        </w:rPr>
-        <w:t>Tranel, D., “</w:t>
-      </w:r>
-      <w:r>
-        <w:rPr>
-          <w:rStyle w:val="normaltextrun"/>
-        </w:rPr>
-        <w:t>Exploring the influence of handedness in the localization of general cognitive ability,”</w:t>
-      </w:r>
-      <w:r>
-        <w:rPr>
-          <w:rStyle w:val="normaltextrun"/>
-        </w:rPr>
-        <w:t xml:space="preserve"> Society for Neuroscience</w:t>
-      </w:r>
-      <w:r>
-        <w:rPr>
-          <w:rStyle w:val="normaltextrun"/>
-        </w:rPr>
-        <w:t xml:space="preserve"> Annual Meeting, Oct. 2024, Chicago, IL.</w:t>
+        <w:rPr>
+          <w:rStyle w:val="normaltextrun"/>
+        </w:rPr>
+        <w:t>Michaelson, J., &amp;</w:t>
+      </w:r>
+      <w:r>
+        <w:rPr>
+          <w:rStyle w:val="normaltextrun"/>
+        </w:rPr>
+        <w:t xml:space="preserve"> Tranel, D., “</w:t>
+      </w:r>
+      <w:r>
+        <w:rPr>
+          <w:rStyle w:val="normaltextrun"/>
+        </w:rPr>
+        <w:t>Neuroanatomical correlates of response patters in a measure of phonemic verbal fluency by participants with focal brain injury</w:t>
+      </w:r>
+      <w:r>
+        <w:rPr>
+          <w:rStyle w:val="normaltextrun"/>
+        </w:rPr>
+        <w:t>,” Society for Neuroscience Annual Meeting, Oct., 2024, Chicago, IL.</w:t>
       </w:r>
     </w:p>
     <w:p>
@@ -4769,12 +4741,29 @@
         <w:spacing w:before="0" w:beforeAutospacing="0" w:after="0" w:afterAutospacing="0"/>
         <w:ind w:left="720" w:hanging="720"/>
         <w:textAlignment w:val="baseline"/>
-      </w:pPr>
-      <w:r>
-        <w:rPr>
-          <w:rStyle w:val="normaltextrun"/>
-        </w:rPr>
-        <w:t xml:space="preserve">Kennedy, M., </w:t>
+        <w:rPr>
+          <w:rStyle w:val="normaltextrun"/>
+        </w:rPr>
+      </w:pPr>
+      <w:r>
+        <w:rPr>
+          <w:rStyle w:val="normaltextrun"/>
+        </w:rPr>
+        <w:t>McNichol, B., Bowren, M., Langbehn, K.</w:t>
+      </w:r>
+      <w:r>
+        <w:rPr>
+          <w:rStyle w:val="normaltextrun"/>
+        </w:rPr>
+        <w:t>,</w:t>
+      </w:r>
+      <w:r>
+        <w:rPr>
+          <w:rStyle w:val="normaltextrun"/>
+          <w:b/>
+          <w:bCs/>
+        </w:rPr>
+        <w:t xml:space="preserve"> </w:t>
       </w:r>
       <w:r>
         <w:rPr>
@@ -4788,10 +4777,37 @@
         <w:rPr>
           <w:rStyle w:val="normaltextrun"/>
         </w:rPr>
-        <w:t xml:space="preserve">, Peters, JY., Gonzalez, R., McCleery, A., Traer, JA., &amp; Kliemann, D., “Affective Prosody Perception and Psychopathology Traits,” </w:t>
-      </w:r>
-      <w:r>
-        <w:t>Summer Undergraduate Research Conference, July, 2024, Iowa City, IA.</w:t>
+        <w:t xml:space="preserve">, </w:t>
+      </w:r>
+      <w:r>
+        <w:t xml:space="preserve">Boes, AD., </w:t>
+      </w:r>
+      <w:r>
+        <w:t xml:space="preserve">&amp; </w:t>
+      </w:r>
+      <w:r>
+        <w:rPr>
+          <w:rStyle w:val="normaltextrun"/>
+        </w:rPr>
+        <w:t>Tranel, D., “</w:t>
+      </w:r>
+      <w:r>
+        <w:rPr>
+          <w:rStyle w:val="normaltextrun"/>
+        </w:rPr>
+        <w:t>Exploring the influence of handedness in the localization of general cognitive ability,”</w:t>
+      </w:r>
+      <w:r>
+        <w:rPr>
+          <w:rStyle w:val="normaltextrun"/>
+        </w:rPr>
+        <w:t xml:space="preserve"> Society for Neuroscience</w:t>
+      </w:r>
+      <w:r>
+        <w:rPr>
+          <w:rStyle w:val="normaltextrun"/>
+        </w:rPr>
+        <w:t xml:space="preserve"> Annual Meeting, Oct. 2024, Chicago, IL.</w:t>
       </w:r>
     </w:p>
     <w:p>
@@ -4800,16 +4816,13 @@
         <w:spacing w:before="0" w:beforeAutospacing="0" w:after="0" w:afterAutospacing="0"/>
         <w:ind w:left="720" w:hanging="720"/>
         <w:textAlignment w:val="baseline"/>
-        <w:rPr>
-          <w:rStyle w:val="normaltextrun"/>
-        </w:rPr>
       </w:pPr>
       <w:r>
         <w:rPr>
           <w:rStyle w:val="normaltextrun"/>
         </w:rPr>
         <w:lastRenderedPageBreak/>
-        <w:t xml:space="preserve">Jouhikainen, P., Luna, J., Peters, JY., </w:t>
+        <w:t xml:space="preserve">Kennedy, M., </w:t>
       </w:r>
       <w:r>
         <w:rPr>
@@ -4823,7 +4836,10 @@
         <w:rPr>
           <w:rStyle w:val="normaltextrun"/>
         </w:rPr>
-        <w:t>, &amp; Kliemann, D., “Continuous Rating of Basic Emotional Dimensions during Passive Video Watching,” Summer Undergraduate Research Conference, July, 2024, Iowa City, IA.</w:t>
+        <w:t xml:space="preserve">, Peters, JY., Gonzalez, R., McCleery, A., Traer, JA., &amp; Kliemann, D., “Affective Prosody Perception and Psychopathology Traits,” </w:t>
+      </w:r>
+      <w:r>
+        <w:t>Summer Undergraduate Research Conference, July, 2024, Iowa City, IA.</w:t>
       </w:r>
     </w:p>
     <w:p>
@@ -4832,20 +4848,15 @@
         <w:spacing w:before="0" w:beforeAutospacing="0" w:after="0" w:afterAutospacing="0"/>
         <w:ind w:left="720" w:hanging="720"/>
         <w:textAlignment w:val="baseline"/>
-      </w:pPr>
-      <w:r>
-        <w:rPr>
-          <w:rStyle w:val="normaltextrun"/>
-        </w:rPr>
-        <w:t>Ogden, K., Deifelt Streese, C., Bruss, J.,</w:t>
-      </w:r>
-      <w:r>
-        <w:rPr>
-          <w:rStyle w:val="normaltextrun"/>
-          <w:b/>
-          <w:bCs/>
-        </w:rPr>
-        <w:t xml:space="preserve"> </w:t>
+        <w:rPr>
+          <w:rStyle w:val="normaltextrun"/>
+        </w:rPr>
+      </w:pPr>
+      <w:r>
+        <w:rPr>
+          <w:rStyle w:val="normaltextrun"/>
+        </w:rPr>
+        <w:t xml:space="preserve">Jouhikainen, P., Luna, J., Peters, JY., </w:t>
       </w:r>
       <w:r>
         <w:rPr>
@@ -4859,7 +4870,7 @@
         <w:rPr>
           <w:rStyle w:val="normaltextrun"/>
         </w:rPr>
-        <w:t>, Michaelson, J., &amp; Tranel, D., “Patterns of responses on a word generation task could tell us about how the brain organizes language,” Computational Psychiatry Symposium, April 2024, Iowa City, IA.</w:t>
+        <w:t>, &amp; Kliemann, D., “Continuous Rating of Basic Emotional Dimensions during Passive Video Watching,” Summer Undergraduate Research Conference, July, 2024, Iowa City, IA.</w:t>
       </w:r>
     </w:p>
     <w:p>
@@ -4868,10 +4879,21 @@
         <w:spacing w:before="0" w:beforeAutospacing="0" w:after="0" w:afterAutospacing="0"/>
         <w:ind w:left="720" w:hanging="720"/>
         <w:textAlignment w:val="baseline"/>
-        <w:rPr>
-          <w:rStyle w:val="normaltextrun"/>
-        </w:rPr>
-      </w:pPr>
+      </w:pPr>
+      <w:r>
+        <w:rPr>
+          <w:rStyle w:val="normaltextrun"/>
+        </w:rPr>
+        <w:t>Ogden, K., Deifelt Streese, C., Bruss, J.,</w:t>
+      </w:r>
+      <w:r>
+        <w:rPr>
+          <w:rStyle w:val="normaltextrun"/>
+          <w:b/>
+          <w:bCs/>
+        </w:rPr>
+        <w:t xml:space="preserve"> </w:t>
+      </w:r>
       <w:r>
         <w:rPr>
           <w:rStyle w:val="normaltextrun"/>
@@ -4884,31 +4906,7 @@
         <w:rPr>
           <w:rStyle w:val="normaltextrun"/>
         </w:rPr>
-        <w:t xml:space="preserve">, </w:t>
-      </w:r>
-      <w:r>
-        <w:rPr>
-          <w:rStyle w:val="normaltextrun"/>
-        </w:rPr>
-        <w:t>Peters, J</w:t>
-      </w:r>
-      <w:r>
-        <w:rPr>
-          <w:rStyle w:val="normaltextrun"/>
-        </w:rPr>
-        <w:t>Y., Luna, JT., Kliemann, D., &amp; Traer, JA., “Low-level acoustic feature perception differs across affective prosody,”</w:t>
-      </w:r>
-      <w:r>
-        <w:rPr>
-          <w:rStyle w:val="normaltextrun"/>
-        </w:rPr>
-        <w:t xml:space="preserve"> Cognitive Neuroscience Society Annual Meeting, </w:t>
-      </w:r>
-      <w:r>
-        <w:rPr>
-          <w:rStyle w:val="normaltextrun"/>
-        </w:rPr>
-        <w:t>April 2024, Toronto, ON.</w:t>
+        <w:t>, Michaelson, J., &amp; Tranel, D., “Patterns of responses on a word generation task could tell us about how the brain organizes language,” Computational Psychiatry Symposium, April 2024, Iowa City, IA.</w:t>
       </w:r>
     </w:p>
     <w:p>
@@ -4924,25 +4922,40 @@
       <w:r>
         <w:rPr>
           <w:rStyle w:val="normaltextrun"/>
-        </w:rPr>
-        <w:tab/>
-      </w:r>
-      <w:r>
-        <w:rPr>
-          <w:rStyle w:val="normaltextrun"/>
-          <w:sz w:val="16"/>
-          <w:szCs w:val="16"/>
-        </w:rPr>
-        <w:t xml:space="preserve">-  </w:t>
-      </w:r>
-      <w:r>
-        <w:rPr>
-          <w:rStyle w:val="normaltextrun"/>
-        </w:rPr>
-        <w:t xml:space="preserve">also presented at </w:t>
-      </w:r>
-      <w:r>
-        <w:t>Wisconsin Symposium on Emotion, April 2024, Madison, WI.</w:t>
+          <w:b/>
+          <w:bCs/>
+        </w:rPr>
+        <w:t>Skye, J.</w:t>
+      </w:r>
+      <w:r>
+        <w:rPr>
+          <w:rStyle w:val="normaltextrun"/>
+        </w:rPr>
+        <w:t xml:space="preserve">, </w:t>
+      </w:r>
+      <w:r>
+        <w:rPr>
+          <w:rStyle w:val="normaltextrun"/>
+        </w:rPr>
+        <w:t>Peters, J</w:t>
+      </w:r>
+      <w:r>
+        <w:rPr>
+          <w:rStyle w:val="normaltextrun"/>
+        </w:rPr>
+        <w:t>Y., Luna, JT., Kliemann, D., &amp; Traer, JA., “Low-level acoustic feature perception differs across affective prosody,”</w:t>
+      </w:r>
+      <w:r>
+        <w:rPr>
+          <w:rStyle w:val="normaltextrun"/>
+        </w:rPr>
+        <w:t xml:space="preserve"> Cognitive Neuroscience Society Annual Meeting, </w:t>
+      </w:r>
+      <w:r>
+        <w:rPr>
+          <w:rStyle w:val="normaltextrun"/>
+        </w:rPr>
+        <w:t>April 2024, Toronto, ON.</w:t>
       </w:r>
     </w:p>
     <w:p>
@@ -4951,46 +4964,33 @@
         <w:spacing w:before="0" w:beforeAutospacing="0" w:after="0" w:afterAutospacing="0"/>
         <w:ind w:left="720" w:hanging="720"/>
         <w:textAlignment w:val="baseline"/>
-      </w:pPr>
-      <w:r>
-        <w:rPr>
-          <w:rStyle w:val="normaltextrun"/>
-          <w:b/>
-          <w:bCs/>
-        </w:rPr>
-        <w:t>Skye, J.</w:t>
-      </w:r>
-      <w:r>
-        <w:rPr>
-          <w:rStyle w:val="normaltextrun"/>
-        </w:rPr>
-        <w:t xml:space="preserve">, Bruss, J., Tranel, D., </w:t>
-      </w:r>
-      <w:r>
-        <w:rPr>
-          <w:rStyle w:val="normaltextrun"/>
-        </w:rPr>
-        <w:t>&amp;</w:t>
-      </w:r>
-      <w:r>
-        <w:rPr>
-          <w:rStyle w:val="normaltextrun"/>
-        </w:rPr>
-        <w:t xml:space="preserve"> Boes, A</w:t>
-      </w:r>
-      <w:r>
-        <w:rPr>
-          <w:rStyle w:val="normaltextrun"/>
-        </w:rPr>
-        <w:t>D</w:t>
-      </w:r>
-      <w:r>
-        <w:rPr>
-          <w:rStyle w:val="normaltextrun"/>
-        </w:rPr>
-        <w:t>., “Uncovering the Latent Structure of Visuospatial Ability and Predicting Visuospatial Function,” Proceedings of University of Iowa Neuroscience Research Day, Nov. 7, 2022.</w:t>
-      </w:r>
-      <w:bookmarkEnd w:id="1"/>
+        <w:rPr>
+          <w:rStyle w:val="normaltextrun"/>
+        </w:rPr>
+      </w:pPr>
+      <w:r>
+        <w:rPr>
+          <w:rStyle w:val="normaltextrun"/>
+        </w:rPr>
+        <w:tab/>
+      </w:r>
+      <w:r>
+        <w:rPr>
+          <w:rStyle w:val="normaltextrun"/>
+          <w:sz w:val="16"/>
+          <w:szCs w:val="16"/>
+        </w:rPr>
+        <w:t xml:space="preserve">-  </w:t>
+      </w:r>
+      <w:r>
+        <w:rPr>
+          <w:rStyle w:val="normaltextrun"/>
+        </w:rPr>
+        <w:t xml:space="preserve">also presented at </w:t>
+      </w:r>
+      <w:r>
+        <w:t>Wisconsin Symposium on Emotion, April 2024, Madison, WI.</w:t>
+      </w:r>
     </w:p>
     <w:p>
       <w:pPr>
@@ -5000,62 +5000,45 @@
         <w:textAlignment w:val="baseline"/>
       </w:pPr>
       <w:r>
-        <w:t xml:space="preserve">Howard, P., Sullivan, AW., </w:t>
-      </w:r>
-      <w:r>
-        <w:rPr>
+        <w:rPr>
+          <w:rStyle w:val="normaltextrun"/>
           <w:b/>
           <w:bCs/>
         </w:rPr>
         <w:t>Skye, J.</w:t>
       </w:r>
       <w:r>
-        <w:t xml:space="preserve">, Bruss, J., </w:t>
-      </w:r>
-      <w:r>
+        <w:rPr>
+          <w:rStyle w:val="normaltextrun"/>
+        </w:rPr>
+        <w:t xml:space="preserve">, Bruss, J., Tranel, D., </w:t>
+      </w:r>
+      <w:r>
+        <w:rPr>
+          <w:rStyle w:val="normaltextrun"/>
+        </w:rPr>
         <w:t>&amp;</w:t>
       </w:r>
       <w:r>
-        <w:t xml:space="preserve"> </w:t>
-      </w:r>
-      <w:r>
-        <w:t>Boes, A</w:t>
-      </w:r>
-      <w:r>
+        <w:rPr>
+          <w:rStyle w:val="normaltextrun"/>
+        </w:rPr>
+        <w:t xml:space="preserve"> Boes, A</w:t>
+      </w:r>
+      <w:r>
+        <w:rPr>
+          <w:rStyle w:val="normaltextrun"/>
+        </w:rPr>
         <w:t>D</w:t>
       </w:r>
       <w:r>
-        <w:t>., “</w:t>
-      </w:r>
-      <w:r>
-        <w:t>Predicting executive function with lesion symptom mapping following early-onset acquired brain lesions</w:t>
-      </w:r>
-      <w:r>
-        <w:t xml:space="preserve">,” </w:t>
-      </w:r>
-      <w:r>
-        <w:t xml:space="preserve">Iowa </w:t>
-      </w:r>
-      <w:r>
-        <w:t xml:space="preserve">Summer </w:t>
-      </w:r>
-      <w:r>
-        <w:t>Research Fellowship Program</w:t>
-      </w:r>
-      <w:r>
-        <w:t xml:space="preserve"> Conference, </w:t>
-      </w:r>
-      <w:r>
-        <w:t>Sept</w:t>
-      </w:r>
-      <w:r>
-        <w:t>.</w:t>
-      </w:r>
-      <w:r>
-        <w:t xml:space="preserve"> 15, 2022. </w:t>
-      </w:r>
-    </w:p>
-    <w:bookmarkEnd w:id="2"/>
+        <w:rPr>
+          <w:rStyle w:val="normaltextrun"/>
+        </w:rPr>
+        <w:t>., “Uncovering the Latent Structure of Visuospatial Ability and Predicting Visuospatial Function,” Proceedings of University of Iowa Neuroscience Research Day, Nov. 7, 2022.</w:t>
+      </w:r>
+      <w:bookmarkEnd w:id="2"/>
+    </w:p>
     <w:p>
       <w:pPr>
         <w:pStyle w:val="paragraph"/>
@@ -5064,31 +5047,62 @@
         <w:textAlignment w:val="baseline"/>
       </w:pPr>
       <w:r>
-        <w:t>Jovany</w:t>
-      </w:r>
-      <w:r>
-        <w:t>, E., Deifelt Streese, C.,</w:t>
-      </w:r>
-      <w:r>
-        <w:rPr>
-          <w:b/>
-          <w:bCs/>
-        </w:rPr>
-        <w:t xml:space="preserve"> Skye, J., </w:t>
-      </w:r>
-      <w:r>
-        <w:t xml:space="preserve">Bruss, J., </w:t>
-      </w:r>
-      <w:r>
-        <w:t xml:space="preserve">&amp; </w:t>
-      </w:r>
-      <w:r>
-        <w:t>Tranel, D.,</w:t>
-      </w:r>
-      <w:r>
-        <w:t xml:space="preserve"> “Neuroanatomical Correlates of Noun and Verb Retrieval in the Controlled Oral Word Association Test,” Secondary Student Training Program Conference, July 29, 2022.</w:t>
-      </w:r>
-    </w:p>
+        <w:t xml:space="preserve">Howard, P., Sullivan, AW., </w:t>
+      </w:r>
+      <w:r>
+        <w:rPr>
+          <w:b/>
+          <w:bCs/>
+        </w:rPr>
+        <w:t>Skye, J.</w:t>
+      </w:r>
+      <w:r>
+        <w:t xml:space="preserve">, Bruss, J., </w:t>
+      </w:r>
+      <w:r>
+        <w:t>&amp;</w:t>
+      </w:r>
+      <w:r>
+        <w:t xml:space="preserve"> </w:t>
+      </w:r>
+      <w:r>
+        <w:t>Boes, A</w:t>
+      </w:r>
+      <w:r>
+        <w:t>D</w:t>
+      </w:r>
+      <w:r>
+        <w:t>., “</w:t>
+      </w:r>
+      <w:r>
+        <w:t>Predicting executive function with lesion symptom mapping following early-onset acquired brain lesions</w:t>
+      </w:r>
+      <w:r>
+        <w:t xml:space="preserve">,” </w:t>
+      </w:r>
+      <w:r>
+        <w:t xml:space="preserve">Iowa </w:t>
+      </w:r>
+      <w:r>
+        <w:t xml:space="preserve">Summer </w:t>
+      </w:r>
+      <w:r>
+        <w:t>Research Fellowship Program</w:t>
+      </w:r>
+      <w:r>
+        <w:t xml:space="preserve"> Conference, </w:t>
+      </w:r>
+      <w:r>
+        <w:t>Sept</w:t>
+      </w:r>
+      <w:r>
+        <w:t>.</w:t>
+      </w:r>
+      <w:r>
+        <w:t xml:space="preserve"> 15, 2022. </w:t>
+      </w:r>
+    </w:p>
+    <w:bookmarkEnd w:id="3"/>
     <w:p>
       <w:pPr>
         <w:pStyle w:val="paragraph"/>
@@ -5097,38 +5111,29 @@
         <w:textAlignment w:val="baseline"/>
       </w:pPr>
       <w:r>
-        <w:t xml:space="preserve">Cudd-Zamora, T., </w:t>
-      </w:r>
-      <w:r>
-        <w:rPr>
-          <w:b/>
-          <w:bCs/>
-        </w:rPr>
-        <w:t>Skye, J.</w:t>
-      </w:r>
-      <w:r>
-        <w:t xml:space="preserve">, Bruss, J., </w:t>
+        <w:t>Jovany</w:t>
+      </w:r>
+      <w:r>
+        <w:t>, E., Deifelt Streese, C.,</w:t>
+      </w:r>
+      <w:r>
+        <w:rPr>
+          <w:b/>
+          <w:bCs/>
+        </w:rPr>
+        <w:t xml:space="preserve"> Skye, J., </w:t>
+      </w:r>
+      <w:r>
+        <w:t xml:space="preserve">Bruss, J., </w:t>
       </w:r>
       <w:r>
         <w:t xml:space="preserve">&amp; </w:t>
       </w:r>
       <w:r>
-        <w:t>Tranel, D., “</w:t>
-      </w:r>
-      <w:r>
-        <w:t>The road to depression: Lesion network mapping of depression over time</w:t>
-      </w:r>
-      <w:r>
-        <w:t xml:space="preserve">,” </w:t>
-      </w:r>
-      <w:r>
-        <w:t xml:space="preserve">Iowa </w:t>
-      </w:r>
-      <w:r>
-        <w:t>Summer Undergraduate Research Conference, July 27, 2022</w:t>
-      </w:r>
-      <w:r>
-        <w:t xml:space="preserve"> &amp; National Conference on Undergraduate Research, April 13-15, 2023. </w:t>
+        <w:t>Tranel, D.,</w:t>
+      </w:r>
+      <w:r>
+        <w:t xml:space="preserve"> “Neuroanatomical Correlates of Noun and Verb Retrieval in the Controlled Oral Word Association Test,” Secondary Student Training Program Conference, July 29, 2022.</w:t>
       </w:r>
     </w:p>
     <w:p>
@@ -5137,49 +5142,40 @@
         <w:spacing w:before="0" w:beforeAutospacing="0" w:after="0" w:afterAutospacing="0"/>
         <w:ind w:left="720" w:hanging="720"/>
         <w:textAlignment w:val="baseline"/>
-        <w:rPr>
-          <w:rStyle w:val="normaltextrun"/>
-        </w:rPr>
-      </w:pPr>
-      <w:r>
-        <w:rPr>
-          <w:rStyle w:val="normaltextrun"/>
-        </w:rPr>
-        <w:t>Msengi, HD.,</w:t>
-      </w:r>
-      <w:r>
-        <w:rPr>
-          <w:rStyle w:val="normaltextrun"/>
-          <w:b/>
-          <w:bCs/>
-        </w:rPr>
-        <w:t xml:space="preserve"> </w:t>
-      </w:r>
-      <w:r>
-        <w:rPr>
-          <w:rStyle w:val="normaltextrun"/>
+      </w:pPr>
+      <w:r>
+        <w:t xml:space="preserve">Cudd-Zamora, T., </w:t>
+      </w:r>
+      <w:r>
+        <w:rPr>
           <w:b/>
           <w:bCs/>
         </w:rPr>
         <w:t>Skye, J.</w:t>
       </w:r>
       <w:r>
-        <w:rPr>
-          <w:rStyle w:val="normaltextrun"/>
-        </w:rPr>
         <w:t xml:space="preserve">, Bruss, J., </w:t>
       </w:r>
       <w:r>
-        <w:rPr>
-          <w:rStyle w:val="normaltextrun"/>
-        </w:rPr>
-        <w:t>&amp;</w:t>
-      </w:r>
-      <w:r>
-        <w:rPr>
-          <w:rStyle w:val="normaltextrun"/>
-        </w:rPr>
-        <w:t xml:space="preserve"> Tranel, D., “Depression and anxiety are associated with distinct neural systems in neurological patients,” Iowa Summer Undergraduate Research Conference, July 27, 2022.</w:t>
+        <w:t xml:space="preserve">&amp; </w:t>
+      </w:r>
+      <w:r>
+        <w:t>Tranel, D., “</w:t>
+      </w:r>
+      <w:r>
+        <w:t>The road to depression: Lesion network mapping of depression over time</w:t>
+      </w:r>
+      <w:r>
+        <w:t xml:space="preserve">,” </w:t>
+      </w:r>
+      <w:r>
+        <w:t xml:space="preserve">Iowa </w:t>
+      </w:r>
+      <w:r>
+        <w:t>Summer Undergraduate Research Conference, July 27, 2022</w:t>
+      </w:r>
+      <w:r>
+        <w:t xml:space="preserve"> &amp; National Conference on Undergraduate Research, April 13-15, 2023. </w:t>
       </w:r>
     </w:p>
     <w:p>
@@ -5192,12 +5188,15 @@
           <w:rStyle w:val="normaltextrun"/>
         </w:rPr>
       </w:pPr>
-      <w:bookmarkStart w:id="3" w:name="_Hlk130995618"/>
-      <w:r>
-        <w:t>Sullivan, AW.,</w:t>
-      </w:r>
-      <w:r>
-        <w:rPr>
+      <w:r>
+        <w:rPr>
+          <w:rStyle w:val="normaltextrun"/>
+        </w:rPr>
+        <w:t>Msengi, HD.,</w:t>
+      </w:r>
+      <w:r>
+        <w:rPr>
+          <w:rStyle w:val="normaltextrun"/>
           <w:b/>
           <w:bCs/>
         </w:rPr>
@@ -5215,7 +5214,7 @@
         <w:rPr>
           <w:rStyle w:val="normaltextrun"/>
         </w:rPr>
-        <w:t xml:space="preserve">, Bowren, MD., Tranel, D., </w:t>
+        <w:t xml:space="preserve">, Bruss, J., </w:t>
       </w:r>
       <w:r>
         <w:rPr>
@@ -5227,19 +5226,7 @@
         <w:rPr>
           <w:rStyle w:val="normaltextrun"/>
         </w:rPr>
-        <w:t xml:space="preserve"> Boes, A</w:t>
-      </w:r>
-      <w:r>
-        <w:rPr>
-          <w:rStyle w:val="normaltextrun"/>
-        </w:rPr>
-        <w:t>D</w:t>
-      </w:r>
-      <w:r>
-        <w:rPr>
-          <w:rStyle w:val="normaltextrun"/>
-        </w:rPr>
-        <w:t>., “Predicting Language Outcomes Following Early-Onset Acquired Brain Lesions,” American Academy of Clinical Neuropsychology, June 22, 2022.</w:t>
+        <w:t xml:space="preserve"> Tranel, D., “Depression and anxiety are associated with distinct neural systems in neurological patients,” Iowa Summer Undergraduate Research Conference, July 27, 2022.</w:t>
       </w:r>
     </w:p>
     <w:p>
@@ -5248,37 +5235,58 @@
         <w:spacing w:before="0" w:beforeAutospacing="0" w:after="0" w:afterAutospacing="0"/>
         <w:ind w:left="720" w:hanging="720"/>
         <w:textAlignment w:val="baseline"/>
-      </w:pPr>
-      <w:r>
-        <w:rPr>
+        <w:rPr>
+          <w:rStyle w:val="normaltextrun"/>
+        </w:rPr>
+      </w:pPr>
+      <w:bookmarkStart w:id="4" w:name="_Hlk130995618"/>
+      <w:r>
+        <w:t>Sullivan, AW.,</w:t>
+      </w:r>
+      <w:r>
+        <w:rPr>
+          <w:b/>
+          <w:bCs/>
+        </w:rPr>
+        <w:t xml:space="preserve"> </w:t>
+      </w:r>
+      <w:r>
+        <w:rPr>
+          <w:rStyle w:val="normaltextrun"/>
           <w:b/>
           <w:bCs/>
         </w:rPr>
         <w:t>Skye, J.</w:t>
       </w:r>
       <w:r>
-        <w:t>, Tranel, D.,</w:t>
-      </w:r>
-      <w:r>
-        <w:t xml:space="preserve"> and Boes, A</w:t>
-      </w:r>
-      <w:r>
+        <w:rPr>
+          <w:rStyle w:val="normaltextrun"/>
+        </w:rPr>
+        <w:t xml:space="preserve">, Bowren, MD., Tranel, D., </w:t>
+      </w:r>
+      <w:r>
+        <w:rPr>
+          <w:rStyle w:val="normaltextrun"/>
+        </w:rPr>
+        <w:t>&amp;</w:t>
+      </w:r>
+      <w:r>
+        <w:rPr>
+          <w:rStyle w:val="normaltextrun"/>
+        </w:rPr>
+        <w:t xml:space="preserve"> Boes, A</w:t>
+      </w:r>
+      <w:r>
+        <w:rPr>
+          <w:rStyle w:val="normaltextrun"/>
+        </w:rPr>
         <w:t>D</w:t>
       </w:r>
       <w:r>
-        <w:t>.,</w:t>
-      </w:r>
-      <w:r>
-        <w:t xml:space="preserve"> “</w:t>
-      </w:r>
-      <w:r>
-        <w:t>Neural circuitry of time orientation: a lesion study</w:t>
-      </w:r>
-      <w:r>
-        <w:t xml:space="preserve">” </w:t>
-      </w:r>
-      <w:r>
-        <w:t xml:space="preserve">Society for Neuroscience Annual Meeting, Nov. 11, 2021. </w:t>
+        <w:rPr>
+          <w:rStyle w:val="normaltextrun"/>
+        </w:rPr>
+        <w:t>., “Predicting Language Outcomes Following Early-Onset Acquired Brain Lesions,” American Academy of Clinical Neuropsychology, June 22, 2022.</w:t>
       </w:r>
     </w:p>
     <w:p>
@@ -5287,59 +5295,37 @@
         <w:spacing w:before="0" w:beforeAutospacing="0" w:after="0" w:afterAutospacing="0"/>
         <w:ind w:left="720" w:hanging="720"/>
         <w:textAlignment w:val="baseline"/>
-        <w:rPr>
-          <w:rStyle w:val="normaltextrun"/>
-        </w:rPr>
-      </w:pPr>
-      <w:r>
-        <w:rPr>
-          <w:rStyle w:val="normaltextrun"/>
+      </w:pPr>
+      <w:r>
+        <w:rPr>
           <w:b/>
           <w:bCs/>
         </w:rPr>
         <w:t>Skye, J.</w:t>
       </w:r>
       <w:r>
-        <w:rPr>
-          <w:rStyle w:val="normaltextrun"/>
-        </w:rPr>
-        <w:t xml:space="preserve">, Bruss, J., Tranel, D., </w:t>
-      </w:r>
-      <w:r>
-        <w:rPr>
-          <w:rStyle w:val="normaltextrun"/>
-        </w:rPr>
-        <w:t>&amp;</w:t>
-      </w:r>
-      <w:r>
-        <w:rPr>
-          <w:rStyle w:val="normaltextrun"/>
-        </w:rPr>
-        <w:t xml:space="preserve"> Boes, A</w:t>
-      </w:r>
-      <w:r>
-        <w:rPr>
-          <w:rStyle w:val="normaltextrun"/>
-        </w:rPr>
+        <w:t>, Tranel, D.,</w:t>
+      </w:r>
+      <w:r>
+        <w:t xml:space="preserve"> and Boes, A</w:t>
+      </w:r>
+      <w:r>
         <w:t>D</w:t>
       </w:r>
       <w:r>
-        <w:rPr>
-          <w:rStyle w:val="normaltextrun"/>
-        </w:rPr>
-        <w:t>., “Living Out of Sync: Neuroanatomical Correlates of Time Disorientation in Patients with Focal Brain Lesions,” Proceedings of University of Iowa Neuroscience Research Day, Nov</w:t>
-      </w:r>
-      <w:r>
-        <w:rPr>
-          <w:rStyle w:val="normaltextrun"/>
-        </w:rPr>
-        <w:t>.</w:t>
-      </w:r>
-      <w:r>
-        <w:rPr>
-          <w:rStyle w:val="normaltextrun"/>
-        </w:rPr>
-        <w:t xml:space="preserve"> 7, 2021.</w:t>
+        <w:t>.,</w:t>
+      </w:r>
+      <w:r>
+        <w:t xml:space="preserve"> “</w:t>
+      </w:r>
+      <w:r>
+        <w:t>Neural circuitry of time orientation: a lesion study</w:t>
+      </w:r>
+      <w:r>
+        <w:t xml:space="preserve">” </w:t>
+      </w:r>
+      <w:r>
+        <w:t xml:space="preserve">Society for Neuroscience Annual Meeting, Nov. 11, 2021. </w:t>
       </w:r>
     </w:p>
     <w:p>
@@ -5364,7 +5350,7 @@
         <w:rPr>
           <w:rStyle w:val="normaltextrun"/>
         </w:rPr>
-        <w:t xml:space="preserve">, Berns-Leone, C., Bowren, M., Bruss, J., Tranel, D., </w:t>
+        <w:t xml:space="preserve">, Bruss, J., Tranel, D., </w:t>
       </w:r>
       <w:r>
         <w:rPr>
@@ -5388,23 +5374,31 @@
         <w:rPr>
           <w:rStyle w:val="normaltextrun"/>
         </w:rPr>
-        <w:t>., “Co-representation of time and space in the human brain,” Proceedings of University of Iowa Neuroscience Research Day, Nov. 9, 2020, pp. 17.</w:t>
-      </w:r>
-    </w:p>
-    <w:bookmarkEnd w:id="3"/>
+        <w:t>., “Living Out of Sync: Neuroanatomical Correlates of Time Disorientation in Patients with Focal Brain Lesions,” Proceedings of University of Iowa Neuroscience Research Day, Nov</w:t>
+      </w:r>
+      <w:r>
+        <w:rPr>
+          <w:rStyle w:val="normaltextrun"/>
+        </w:rPr>
+        <w:t>.</w:t>
+      </w:r>
+      <w:r>
+        <w:rPr>
+          <w:rStyle w:val="normaltextrun"/>
+        </w:rPr>
+        <w:t xml:space="preserve"> 7, 2021.</w:t>
+      </w:r>
+    </w:p>
     <w:p>
       <w:pPr>
         <w:pStyle w:val="paragraph"/>
         <w:spacing w:before="0" w:beforeAutospacing="0" w:after="0" w:afterAutospacing="0"/>
         <w:ind w:left="720" w:hanging="720"/>
         <w:textAlignment w:val="baseline"/>
-      </w:pPr>
-      <w:r>
-        <w:rPr>
-          <w:rStyle w:val="normaltextrun"/>
-        </w:rPr>
-        <w:t xml:space="preserve">Halow, S.J., </w:t>
-      </w:r>
+        <w:rPr>
+          <w:rStyle w:val="normaltextrun"/>
+        </w:rPr>
+      </w:pPr>
       <w:r>
         <w:rPr>
           <w:rStyle w:val="normaltextrun"/>
@@ -5417,7 +5411,7 @@
         <w:rPr>
           <w:rStyle w:val="normaltextrun"/>
         </w:rPr>
-        <w:t xml:space="preserve">, Lui, J., </w:t>
+        <w:t xml:space="preserve">, Berns-Leone, C., Bowren, M., Bruss, J., Tranel, D., </w:t>
       </w:r>
       <w:r>
         <w:rPr>
@@ -5429,41 +5423,22 @@
         <w:rPr>
           <w:rStyle w:val="normaltextrun"/>
         </w:rPr>
-        <w:t xml:space="preserve"> MacNeilage, P.R., “Visual-vestibular conflict detection is best during active head movement with scene-fixed fixation,” Proceedings of Vision Sciences Society 19</w:t>
-      </w:r>
-      <w:r>
-        <w:rPr>
-          <w:rStyle w:val="normaltextrun"/>
-          <w:vertAlign w:val="superscript"/>
-        </w:rPr>
-        <w:t>th</w:t>
-      </w:r>
-      <w:r>
-        <w:rPr>
-          <w:rStyle w:val="normaltextrun"/>
-        </w:rPr>
-        <w:t xml:space="preserve"> Annual Meeting, May 17-22, 2019, pp. 301.</w:t>
-      </w:r>
-    </w:p>
-    <w:p>
-      <w:pPr>
-        <w:pStyle w:val="Heading2"/>
-        <w:ind w:left="720" w:firstLine="720"/>
-        <w:rPr>
-          <w:rFonts w:asciiTheme="minorHAnsi" w:hAnsiTheme="minorHAnsi" w:cstheme="minorHAnsi"/>
-          <w:b w:val="0"/>
-          <w:bCs w:val="0"/>
-        </w:rPr>
-      </w:pPr>
-      <w:r>
-        <w:rPr>
-          <w:rFonts w:asciiTheme="minorHAnsi" w:hAnsiTheme="minorHAnsi" w:cstheme="minorHAnsi"/>
-          <w:b w:val="0"/>
-          <w:bCs w:val="0"/>
-        </w:rPr>
-        <w:t>Without Abstracts</w:t>
-      </w:r>
-    </w:p>
+        <w:t xml:space="preserve"> Boes, A</w:t>
+      </w:r>
+      <w:r>
+        <w:rPr>
+          <w:rStyle w:val="normaltextrun"/>
+        </w:rPr>
+        <w:t>D</w:t>
+      </w:r>
+      <w:r>
+        <w:rPr>
+          <w:rStyle w:val="normaltextrun"/>
+        </w:rPr>
+        <w:t>., “Co-representation of time and space in the human brain,” Proceedings of University of Iowa Neuroscience Research Day, Nov. 9, 2020, pp. 17.</w:t>
+      </w:r>
+    </w:p>
+    <w:bookmarkEnd w:id="4"/>
     <w:p>
       <w:pPr>
         <w:pStyle w:val="paragraph"/>
@@ -5474,34 +5449,66 @@
       <w:r>
         <w:rPr>
           <w:rStyle w:val="normaltextrun"/>
-          <w:b/>
-          <w:bCs/>
-        </w:rPr>
-        <w:t>Skye, J</w:t>
-      </w:r>
-      <w:r>
-        <w:rPr>
-          <w:rStyle w:val="normaltextrun"/>
-        </w:rPr>
-        <w:t xml:space="preserve">. “Effects of Consciousness on a Quantum Cognitive Model,” </w:t>
-      </w:r>
-      <w:r>
-        <w:rPr>
-          <w:rStyle w:val="normaltextrun"/>
-        </w:rPr>
-        <w:t>University of Nevada – Reno Philosophy of Mind Poster Presentation</w:t>
-      </w:r>
-      <w:r>
-        <w:rPr>
-          <w:rStyle w:val="normaltextrun"/>
-        </w:rPr>
-        <w:t xml:space="preserve"> Session, May 2018.</w:t>
-      </w:r>
-      <w:r>
-        <w:rPr>
-          <w:rStyle w:val="eop"/>
-        </w:rPr>
-        <w:t> </w:t>
+        </w:rPr>
+        <w:t xml:space="preserve">Halow, S.J., </w:t>
+      </w:r>
+      <w:r>
+        <w:rPr>
+          <w:rStyle w:val="normaltextrun"/>
+          <w:b/>
+          <w:bCs/>
+        </w:rPr>
+        <w:t>Skye, J.</w:t>
+      </w:r>
+      <w:r>
+        <w:rPr>
+          <w:rStyle w:val="normaltextrun"/>
+        </w:rPr>
+        <w:t xml:space="preserve">, Lui, J., </w:t>
+      </w:r>
+      <w:r>
+        <w:rPr>
+          <w:rStyle w:val="normaltextrun"/>
+        </w:rPr>
+        <w:t>&amp;</w:t>
+      </w:r>
+      <w:r>
+        <w:rPr>
+          <w:rStyle w:val="normaltextrun"/>
+        </w:rPr>
+        <w:t xml:space="preserve"> MacNeilage, P.R., “Visual-vestibular conflict detection is best during active head movement with scene-fixed fixation,” Proceedings of Vision Sciences Society 19</w:t>
+      </w:r>
+      <w:r>
+        <w:rPr>
+          <w:rStyle w:val="normaltextrun"/>
+          <w:vertAlign w:val="superscript"/>
+        </w:rPr>
+        <w:t>th</w:t>
+      </w:r>
+      <w:r>
+        <w:rPr>
+          <w:rStyle w:val="normaltextrun"/>
+        </w:rPr>
+        <w:t xml:space="preserve"> Annual Meeting, May 17-22, 2019, pp. 301.</w:t>
+      </w:r>
+    </w:p>
+    <w:p>
+      <w:pPr>
+        <w:pStyle w:val="Heading2"/>
+        <w:ind w:left="720" w:firstLine="720"/>
+        <w:rPr>
+          <w:rFonts w:asciiTheme="minorHAnsi" w:hAnsiTheme="minorHAnsi" w:cstheme="minorHAnsi"/>
+          <w:b w:val="0"/>
+          <w:bCs w:val="0"/>
+        </w:rPr>
+      </w:pPr>
+      <w:r>
+        <w:rPr>
+          <w:rFonts w:asciiTheme="minorHAnsi" w:hAnsiTheme="minorHAnsi" w:cstheme="minorHAnsi"/>
+          <w:b w:val="0"/>
+          <w:bCs w:val="0"/>
+        </w:rPr>
+        <w:t>Without Abstracts</w:t>
       </w:r>
     </w:p>
     <w:p>
@@ -5510,6 +5517,46 @@
         <w:spacing w:before="0" w:beforeAutospacing="0" w:after="0" w:afterAutospacing="0"/>
         <w:ind w:left="720" w:hanging="720"/>
         <w:textAlignment w:val="baseline"/>
+      </w:pPr>
+      <w:r>
+        <w:rPr>
+          <w:rStyle w:val="normaltextrun"/>
+          <w:b/>
+          <w:bCs/>
+        </w:rPr>
+        <w:t>Skye, J</w:t>
+      </w:r>
+      <w:r>
+        <w:rPr>
+          <w:rStyle w:val="normaltextrun"/>
+        </w:rPr>
+        <w:t xml:space="preserve">. “Effects of Consciousness on a Quantum Cognitive Model,” </w:t>
+      </w:r>
+      <w:r>
+        <w:rPr>
+          <w:rStyle w:val="normaltextrun"/>
+        </w:rPr>
+        <w:t>University of Nevada – Reno Philosophy of Mind Poster Presentation</w:t>
+      </w:r>
+      <w:r>
+        <w:rPr>
+          <w:rStyle w:val="normaltextrun"/>
+        </w:rPr>
+        <w:t xml:space="preserve"> Session, May 2018.</w:t>
+      </w:r>
+      <w:r>
+        <w:rPr>
+          <w:rStyle w:val="eop"/>
+        </w:rPr>
+        <w:t> </w:t>
+      </w:r>
+    </w:p>
+    <w:p>
+      <w:pPr>
+        <w:pStyle w:val="paragraph"/>
+        <w:spacing w:before="0" w:beforeAutospacing="0" w:after="0" w:afterAutospacing="0"/>
+        <w:ind w:left="720" w:hanging="720"/>
+        <w:textAlignment w:val="baseline"/>
         <w:rPr>
           <w:rFonts w:ascii="Segoe UI" w:hAnsi="Segoe UI" w:cs="Segoe UI"/>
           <w:sz w:val="18"/>
@@ -5578,12 +5625,23 @@
           <w:rFonts w:asciiTheme="minorHAnsi" w:hAnsiTheme="minorHAnsi" w:cstheme="minorHAnsi"/>
         </w:rPr>
       </w:pPr>
+      <w:commentRangeStart w:id="5"/>
       <w:r>
         <w:rPr>
           <w:rFonts w:asciiTheme="minorHAnsi" w:hAnsiTheme="minorHAnsi" w:cstheme="minorHAnsi"/>
         </w:rPr>
         <w:t>Presentations</w:t>
       </w:r>
+      <w:commentRangeEnd w:id="5"/>
+      <w:r>
+        <w:rPr>
+          <w:rStyle w:val="CommentReference"/>
+          <w:rFonts w:asciiTheme="minorHAnsi" w:hAnsiTheme="minorHAnsi" w:cstheme="minorHAnsi"/>
+          <w:sz w:val="24"/>
+          <w:szCs w:val="32"/>
+        </w:rPr>
+        <w:commentReference w:id="5"/>
+      </w:r>
     </w:p>
     <w:p>
       <w:pPr>
@@ -5597,6 +5655,28 @@
         <w:ind w:left="720" w:hanging="720"/>
         <w:rPr>
           <w:rFonts w:asciiTheme="minorHAnsi" w:hAnsiTheme="minorHAnsi" w:cstheme="minorHAnsi"/>
+        </w:rPr>
+      </w:pPr>
+      <w:r>
+        <w:rPr>
+          <w:rFonts w:asciiTheme="minorHAnsi" w:hAnsiTheme="minorHAnsi" w:cstheme="minorHAnsi"/>
+          <w:b/>
+          <w:bCs/>
+        </w:rPr>
+        <w:t>Iowa Neuroimaging Working Group</w:t>
+      </w:r>
+      <w:r>
+        <w:rPr>
+          <w:rFonts w:asciiTheme="minorHAnsi" w:hAnsiTheme="minorHAnsi" w:cstheme="minorHAnsi"/>
+        </w:rPr>
+        <w:t>, “Introducing Lesion Profile Mapping”, October 21, 2025.</w:t>
+      </w:r>
+    </w:p>
+    <w:p>
+      <w:pPr>
+        <w:ind w:left="720" w:hanging="720"/>
+        <w:rPr>
+          <w:rFonts w:asciiTheme="minorHAnsi" w:hAnsiTheme="minorHAnsi" w:cstheme="minorHAnsi"/>
           <w:b/>
           <w:bCs/>
         </w:rPr>
@@ -5665,6 +5745,7 @@
           <w:b/>
           <w:bCs/>
         </w:rPr>
+        <w:lastRenderedPageBreak/>
         <w:t>Iowa Lesion Retreat</w:t>
       </w:r>
       <w:r>
@@ -5755,7 +5836,6 @@
           <w:b/>
           <w:bCs/>
         </w:rPr>
-        <w:lastRenderedPageBreak/>
         <w:t>Neuroscience Seminar</w:t>
       </w:r>
       <w:r>
@@ -6401,25 +6481,19 @@
           <w:rFonts w:asciiTheme="minorHAnsi" w:hAnsiTheme="minorHAnsi" w:cstheme="minorHAnsi"/>
         </w:rPr>
         <w:tab/>
-        <w:t xml:space="preserve"> </w:t>
-      </w:r>
-      <w:r>
-        <w:rPr>
-          <w:rFonts w:asciiTheme="minorHAnsi" w:hAnsiTheme="minorHAnsi" w:cstheme="minorHAnsi"/>
-        </w:rPr>
-        <w:t>Jan</w:t>
-      </w:r>
-      <w:r>
-        <w:rPr>
-          <w:rFonts w:asciiTheme="minorHAnsi" w:hAnsiTheme="minorHAnsi" w:cstheme="minorHAnsi"/>
-        </w:rPr>
-        <w:t>.</w:t>
-      </w:r>
-      <w:r>
-        <w:rPr>
-          <w:rFonts w:asciiTheme="minorHAnsi" w:hAnsiTheme="minorHAnsi" w:cstheme="minorHAnsi"/>
-        </w:rPr>
-        <w:t xml:space="preserve"> 2017</w:t>
+      </w:r>
+      <w:r>
+        <w:rPr>
+          <w:rFonts w:asciiTheme="minorHAnsi" w:hAnsiTheme="minorHAnsi" w:cstheme="minorHAnsi"/>
+        </w:rPr>
+        <w:tab/>
+        <w:t xml:space="preserve">          </w:t>
+      </w:r>
+      <w:r>
+        <w:rPr>
+          <w:rFonts w:asciiTheme="minorHAnsi" w:hAnsiTheme="minorHAnsi" w:cstheme="minorHAnsi"/>
+        </w:rPr>
+        <w:t>2017</w:t>
       </w:r>
       <w:r>
         <w:rPr>
@@ -6431,25 +6505,19 @@
         <w:rPr>
           <w:rFonts w:asciiTheme="minorHAnsi" w:hAnsiTheme="minorHAnsi" w:cstheme="minorHAnsi"/>
         </w:rPr>
-        <w:t xml:space="preserve"> Aug</w:t>
-      </w:r>
-      <w:r>
-        <w:rPr>
-          <w:rFonts w:asciiTheme="minorHAnsi" w:hAnsiTheme="minorHAnsi" w:cstheme="minorHAnsi"/>
-        </w:rPr>
-        <w:t>.</w:t>
-      </w:r>
-      <w:r>
-        <w:rPr>
-          <w:rFonts w:asciiTheme="minorHAnsi" w:hAnsiTheme="minorHAnsi" w:cstheme="minorHAnsi"/>
-        </w:rPr>
-        <w:t xml:space="preserve"> 2019</w:t>
-      </w:r>
-      <w:r>
-        <w:rPr>
-          <w:rFonts w:asciiTheme="minorHAnsi" w:hAnsiTheme="minorHAnsi" w:cstheme="minorHAnsi"/>
-        </w:rPr>
-        <w:t>, &amp; Aug. 2023</w:t>
+        <w:t>2019</w:t>
+      </w:r>
+      <w:r>
+        <w:rPr>
+          <w:rFonts w:asciiTheme="minorHAnsi" w:hAnsiTheme="minorHAnsi" w:cstheme="minorHAnsi"/>
+        </w:rPr>
+        <w:t>, 2023</w:t>
+      </w:r>
+      <w:r>
+        <w:rPr>
+          <w:rFonts w:asciiTheme="minorHAnsi" w:hAnsiTheme="minorHAnsi" w:cstheme="minorHAnsi"/>
+        </w:rPr>
+        <w:t>, 2025</w:t>
       </w:r>
     </w:p>
     <w:p>
@@ -6654,7 +6722,7 @@
           <w:b/>
         </w:rPr>
       </w:pPr>
-      <w:bookmarkStart w:id="4" w:name="_Hlk155041859"/>
+      <w:bookmarkStart w:id="6" w:name="_Hlk155041859"/>
       <w:r>
         <w:rPr>
           <w:rFonts w:asciiTheme="minorHAnsi" w:hAnsiTheme="minorHAnsi" w:cstheme="minorHAnsi"/>
@@ -6777,7 +6845,7 @@
         <w:t>.</w:t>
       </w:r>
     </w:p>
-    <w:bookmarkEnd w:id="4"/>
+    <w:bookmarkEnd w:id="6"/>
     <w:p>
       <w:pPr>
         <w:rPr>
@@ -7156,7 +7224,24 @@
           <w:rFonts w:asciiTheme="minorHAnsi" w:hAnsiTheme="minorHAnsi" w:cstheme="minorHAnsi"/>
         </w:rPr>
         <w:tab/>
-        <w:t xml:space="preserve">  2023 &amp; 2024</w:t>
+      </w:r>
+      <w:r>
+        <w:rPr>
+          <w:rFonts w:asciiTheme="minorHAnsi" w:hAnsiTheme="minorHAnsi" w:cstheme="minorHAnsi"/>
+        </w:rPr>
+        <w:t xml:space="preserve">  </w:t>
+      </w:r>
+      <w:r>
+        <w:rPr>
+          <w:rFonts w:asciiTheme="minorHAnsi" w:hAnsiTheme="minorHAnsi" w:cstheme="minorHAnsi"/>
+        </w:rPr>
+        <w:t xml:space="preserve">  2023 </w:t>
+      </w:r>
+      <w:r>
+        <w:rPr>
+          <w:rFonts w:asciiTheme="minorHAnsi" w:hAnsiTheme="minorHAnsi" w:cstheme="minorHAnsi"/>
+        </w:rPr>
+        <w:t>- 2025</w:t>
       </w:r>
     </w:p>
     <w:p>
@@ -7176,6 +7261,12 @@
           <w:rFonts w:asciiTheme="minorHAnsi" w:hAnsiTheme="minorHAnsi" w:cstheme="minorHAnsi"/>
         </w:rPr>
         <w:t>Speaker 2023, organizing committee 2024</w:t>
+      </w:r>
+      <w:r>
+        <w:rPr>
+          <w:rFonts w:asciiTheme="minorHAnsi" w:hAnsiTheme="minorHAnsi" w:cstheme="minorHAnsi"/>
+        </w:rPr>
+        <w:t>-2025</w:t>
       </w:r>
     </w:p>
     <w:p>
@@ -7286,7 +7377,7 @@
         <w:rPr>
           <w:rFonts w:asciiTheme="minorHAnsi" w:hAnsiTheme="minorHAnsi" w:cstheme="minorHAnsi"/>
         </w:rPr>
-        <w:t>4</w:t>
+        <w:t>5</w:t>
       </w:r>
     </w:p>
     <w:p>
@@ -7338,7 +7429,13 @@
         <w:rPr>
           <w:rFonts w:asciiTheme="minorHAnsi" w:hAnsiTheme="minorHAnsi" w:cstheme="minorHAnsi"/>
         </w:rPr>
-        <w:t>023 – 2024</w:t>
+        <w:t>023 – 202</w:t>
+      </w:r>
+      <w:r>
+        <w:rPr>
+          <w:rFonts w:asciiTheme="minorHAnsi" w:hAnsiTheme="minorHAnsi" w:cstheme="minorHAnsi"/>
+        </w:rPr>
+        <w:t>5</w:t>
       </w:r>
     </w:p>
     <w:p>
@@ -7578,8 +7675,101 @@
         <w:rPr>
           <w:rFonts w:asciiTheme="minorHAnsi" w:hAnsiTheme="minorHAnsi" w:cstheme="minorHAnsi"/>
         </w:rPr>
+        <w:t xml:space="preserve">      </w:t>
+      </w:r>
+      <w:r>
+        <w:rPr>
+          <w:rFonts w:asciiTheme="minorHAnsi" w:hAnsiTheme="minorHAnsi" w:cstheme="minorHAnsi"/>
+        </w:rPr>
+        <w:t>20</w:t>
+      </w:r>
+      <w:r>
+        <w:rPr>
+          <w:rFonts w:asciiTheme="minorHAnsi" w:hAnsiTheme="minorHAnsi" w:cstheme="minorHAnsi"/>
+        </w:rPr>
+        <w:t>18</w:t>
+      </w:r>
+      <w:r>
+        <w:rPr>
+          <w:rFonts w:asciiTheme="minorHAnsi" w:hAnsiTheme="minorHAnsi" w:cstheme="minorHAnsi"/>
+        </w:rPr>
+        <w:t xml:space="preserve">, </w:t>
+      </w:r>
+      <w:r>
+        <w:rPr>
+          <w:rFonts w:asciiTheme="minorHAnsi" w:hAnsiTheme="minorHAnsi" w:cstheme="minorHAnsi"/>
+        </w:rPr>
+        <w:t>2019</w:t>
+      </w:r>
+      <w:r>
+        <w:rPr>
+          <w:rFonts w:asciiTheme="minorHAnsi" w:hAnsiTheme="minorHAnsi" w:cstheme="minorHAnsi"/>
+        </w:rPr>
+        <w:t>, 2021</w:t>
+      </w:r>
+      <w:r>
+        <w:rPr>
+          <w:rFonts w:asciiTheme="minorHAnsi" w:hAnsiTheme="minorHAnsi" w:cstheme="minorHAnsi"/>
+        </w:rPr>
+        <w:t>, 2025</w:t>
+      </w:r>
+    </w:p>
+    <w:p>
+      <w:pPr>
+        <w:rPr>
+          <w:rFonts w:asciiTheme="minorHAnsi" w:hAnsiTheme="minorHAnsi" w:cstheme="minorHAnsi"/>
+        </w:rPr>
+      </w:pPr>
+      <w:r>
+        <w:rPr>
+          <w:rFonts w:asciiTheme="minorHAnsi" w:hAnsiTheme="minorHAnsi" w:cstheme="minorHAnsi"/>
+          <w:b/>
+          <w:bCs/>
+        </w:rPr>
+        <w:t>Vision Action Symposium in Honor of Lance Optican</w:t>
+      </w:r>
+      <w:r>
+        <w:rPr>
+          <w:rFonts w:asciiTheme="minorHAnsi" w:hAnsiTheme="minorHAnsi" w:cstheme="minorHAnsi"/>
+        </w:rPr>
+        <w:t xml:space="preserve"> </w:t>
+      </w:r>
+      <w:r>
+        <w:rPr>
+          <w:rFonts w:asciiTheme="minorHAnsi" w:hAnsiTheme="minorHAnsi" w:cstheme="minorHAnsi"/>
+        </w:rPr>
         <w:tab/>
-        <w:t xml:space="preserve">  </w:t>
+      </w:r>
+      <w:r>
+        <w:rPr>
+          <w:rFonts w:asciiTheme="minorHAnsi" w:hAnsiTheme="minorHAnsi" w:cstheme="minorHAnsi"/>
+        </w:rPr>
+        <w:tab/>
+      </w:r>
+      <w:r>
+        <w:rPr>
+          <w:rFonts w:asciiTheme="minorHAnsi" w:hAnsiTheme="minorHAnsi" w:cstheme="minorHAnsi"/>
+        </w:rPr>
+        <w:tab/>
+      </w:r>
+      <w:r>
+        <w:rPr>
+          <w:rFonts w:asciiTheme="minorHAnsi" w:hAnsiTheme="minorHAnsi" w:cstheme="minorHAnsi"/>
+        </w:rPr>
+        <w:tab/>
+      </w:r>
+      <w:r>
+        <w:rPr>
+          <w:rFonts w:asciiTheme="minorHAnsi" w:hAnsiTheme="minorHAnsi" w:cstheme="minorHAnsi"/>
+        </w:rPr>
+        <w:tab/>
+      </w:r>
+      <w:r>
+        <w:rPr>
+          <w:rFonts w:asciiTheme="minorHAnsi" w:hAnsiTheme="minorHAnsi" w:cstheme="minorHAnsi"/>
+        </w:rPr>
+        <w:tab/>
+        <w:t xml:space="preserve">     </w:t>
       </w:r>
       <w:r>
         <w:rPr>
@@ -7591,120 +7781,6 @@
         <w:rPr>
           <w:rFonts w:asciiTheme="minorHAnsi" w:hAnsiTheme="minorHAnsi" w:cstheme="minorHAnsi"/>
         </w:rPr>
-        <w:t>20</w:t>
-      </w:r>
-      <w:r>
-        <w:rPr>
-          <w:rFonts w:asciiTheme="minorHAnsi" w:hAnsiTheme="minorHAnsi" w:cstheme="minorHAnsi"/>
-        </w:rPr>
-        <w:t>18</w:t>
-      </w:r>
-      <w:r>
-        <w:rPr>
-          <w:rFonts w:asciiTheme="minorHAnsi" w:hAnsiTheme="minorHAnsi" w:cstheme="minorHAnsi"/>
-        </w:rPr>
-        <w:t xml:space="preserve">, </w:t>
-      </w:r>
-      <w:r>
-        <w:rPr>
-          <w:rFonts w:asciiTheme="minorHAnsi" w:hAnsiTheme="minorHAnsi" w:cstheme="minorHAnsi"/>
-        </w:rPr>
-        <w:t>2019</w:t>
-      </w:r>
-      <w:r>
-        <w:rPr>
-          <w:rFonts w:asciiTheme="minorHAnsi" w:hAnsiTheme="minorHAnsi" w:cstheme="minorHAnsi"/>
-        </w:rPr>
-        <w:t>, &amp; 2021</w:t>
-      </w:r>
-    </w:p>
-    <w:p>
-      <w:pPr>
-        <w:ind w:left="720"/>
-        <w:rPr>
-          <w:rFonts w:asciiTheme="minorHAnsi" w:hAnsiTheme="minorHAnsi" w:cstheme="minorHAnsi"/>
-        </w:rPr>
-      </w:pPr>
-      <w:r>
-        <w:rPr>
-          <w:rFonts w:asciiTheme="minorHAnsi" w:hAnsiTheme="minorHAnsi" w:cstheme="minorHAnsi"/>
-        </w:rPr>
-        <w:t>Experiment I helped with discussed in symposium session “Visual-vestibular conflict detection is better during active than passive head movement” (MacNeilage et al.</w:t>
-      </w:r>
-      <w:r>
-        <w:rPr>
-          <w:rFonts w:asciiTheme="minorHAnsi" w:hAnsiTheme="minorHAnsi" w:cstheme="minorHAnsi"/>
-        </w:rPr>
-        <w:t>, 2018</w:t>
-      </w:r>
-      <w:r>
-        <w:rPr>
-          <w:rFonts w:asciiTheme="minorHAnsi" w:hAnsiTheme="minorHAnsi" w:cstheme="minorHAnsi"/>
-        </w:rPr>
-        <w:t>)</w:t>
-      </w:r>
-    </w:p>
-    <w:p>
-      <w:pPr>
-        <w:rPr>
-          <w:rFonts w:asciiTheme="minorHAnsi" w:hAnsiTheme="minorHAnsi" w:cstheme="minorHAnsi"/>
-        </w:rPr>
-      </w:pPr>
-      <w:r>
-        <w:rPr>
-          <w:rFonts w:asciiTheme="minorHAnsi" w:hAnsiTheme="minorHAnsi" w:cstheme="minorHAnsi"/>
-          <w:b/>
-          <w:bCs/>
-        </w:rPr>
-        <w:t>Vision Action Symposium in Honor of Lance Optican</w:t>
-      </w:r>
-      <w:r>
-        <w:rPr>
-          <w:rFonts w:asciiTheme="minorHAnsi" w:hAnsiTheme="minorHAnsi" w:cstheme="minorHAnsi"/>
-        </w:rPr>
-        <w:t xml:space="preserve"> </w:t>
-      </w:r>
-      <w:r>
-        <w:rPr>
-          <w:rFonts w:asciiTheme="minorHAnsi" w:hAnsiTheme="minorHAnsi" w:cstheme="minorHAnsi"/>
-        </w:rPr>
-        <w:tab/>
-      </w:r>
-      <w:r>
-        <w:rPr>
-          <w:rFonts w:asciiTheme="minorHAnsi" w:hAnsiTheme="minorHAnsi" w:cstheme="minorHAnsi"/>
-        </w:rPr>
-        <w:tab/>
-      </w:r>
-      <w:r>
-        <w:rPr>
-          <w:rFonts w:asciiTheme="minorHAnsi" w:hAnsiTheme="minorHAnsi" w:cstheme="minorHAnsi"/>
-        </w:rPr>
-        <w:tab/>
-      </w:r>
-      <w:r>
-        <w:rPr>
-          <w:rFonts w:asciiTheme="minorHAnsi" w:hAnsiTheme="minorHAnsi" w:cstheme="minorHAnsi"/>
-        </w:rPr>
-        <w:tab/>
-      </w:r>
-      <w:r>
-        <w:rPr>
-          <w:rFonts w:asciiTheme="minorHAnsi" w:hAnsiTheme="minorHAnsi" w:cstheme="minorHAnsi"/>
-        </w:rPr>
-        <w:tab/>
-      </w:r>
-      <w:r>
-        <w:rPr>
-          <w:rFonts w:asciiTheme="minorHAnsi" w:hAnsiTheme="minorHAnsi" w:cstheme="minorHAnsi"/>
-        </w:rPr>
-        <w:tab/>
-        <w:t xml:space="preserve">       </w:t>
-      </w:r>
-      <w:r>
-        <w:rPr>
-          <w:rFonts w:asciiTheme="minorHAnsi" w:hAnsiTheme="minorHAnsi" w:cstheme="minorHAnsi"/>
-        </w:rPr>
         <w:t>Nov</w:t>
       </w:r>
       <w:r>
@@ -7731,6 +7807,7 @@
         <w:rPr>
           <w:rFonts w:asciiTheme="minorHAnsi" w:hAnsiTheme="minorHAnsi" w:cstheme="minorHAnsi"/>
         </w:rPr>
+        <w:lastRenderedPageBreak/>
         <w:t>San Diego, CA</w:t>
       </w:r>
     </w:p>
@@ -7751,11 +7828,11 @@
           <w:rFonts w:asciiTheme="minorHAnsi" w:hAnsiTheme="minorHAnsi" w:cstheme="minorHAnsi"/>
         </w:rPr>
       </w:pPr>
-      <w:r>
-        <w:rPr>
-          <w:rFonts w:asciiTheme="minorHAnsi" w:hAnsiTheme="minorHAnsi" w:cstheme="minorHAnsi"/>
-        </w:rPr>
-        <w:lastRenderedPageBreak/>
+      <w:commentRangeStart w:id="7"/>
+      <w:r>
+        <w:rPr>
+          <w:rFonts w:asciiTheme="minorHAnsi" w:hAnsiTheme="minorHAnsi" w:cstheme="minorHAnsi"/>
+        </w:rPr>
         <w:t xml:space="preserve">Academic and </w:t>
       </w:r>
       <w:r>
@@ -7763,6 +7840,16 @@
           <w:rFonts w:asciiTheme="minorHAnsi" w:hAnsiTheme="minorHAnsi" w:cstheme="minorHAnsi"/>
         </w:rPr>
         <w:t>Community Service</w:t>
+      </w:r>
+      <w:commentRangeEnd w:id="7"/>
+      <w:r>
+        <w:rPr>
+          <w:rStyle w:val="CommentReference"/>
+          <w:rFonts w:asciiTheme="minorHAnsi" w:hAnsiTheme="minorHAnsi" w:cstheme="minorHAnsi"/>
+          <w:sz w:val="24"/>
+          <w:szCs w:val="32"/>
+        </w:rPr>
+        <w:commentReference w:id="7"/>
       </w:r>
     </w:p>
     <w:p>
@@ -8657,6 +8744,13 @@
           <w:rFonts w:asciiTheme="minorHAnsi" w:hAnsiTheme="minorHAnsi" w:cstheme="minorHAnsi"/>
           <w:bCs/>
         </w:rPr>
+        <w:t xml:space="preserve">         </w:t>
+      </w:r>
+      <w:r>
+        <w:rPr>
+          <w:rFonts w:asciiTheme="minorHAnsi" w:hAnsiTheme="minorHAnsi" w:cstheme="minorHAnsi"/>
+          <w:bCs/>
+        </w:rPr>
         <w:t>2024</w:t>
       </w:r>
       <w:r>
@@ -9430,6 +9524,7 @@
         <w:rPr>
           <w:rStyle w:val="normaltextrun"/>
         </w:rPr>
+        <w:lastRenderedPageBreak/>
         <w:t xml:space="preserve">On committee to develop gender-inclusive housing program implemented in </w:t>
       </w:r>
     </w:p>
@@ -9464,7 +9559,6 @@
         <w:rPr>
           <w:rStyle w:val="normaltextrun"/>
         </w:rPr>
-        <w:lastRenderedPageBreak/>
         <w:t>Managed student housing data and created unique profiles for incoming residents</w:t>
       </w:r>
     </w:p>
@@ -10143,7 +10237,7 @@
           <w:rFonts w:asciiTheme="minorHAnsi" w:hAnsiTheme="minorHAnsi" w:cstheme="minorHAnsi"/>
           <w:b/>
         </w:rPr>
-        <w:t>Programming</w:t>
+        <w:t>Languages</w:t>
       </w:r>
       <w:r>
         <w:rPr>
@@ -10163,17 +10257,83 @@
         </w:rPr>
         <w:t>MATLAB, R, bash</w:t>
       </w:r>
-    </w:p>
-    <w:p>
-      <w:pPr>
-        <w:rPr>
-          <w:rFonts w:asciiTheme="minorHAnsi" w:hAnsiTheme="minorHAnsi" w:cstheme="minorHAnsi"/>
-        </w:rPr>
-      </w:pPr>
-      <w:r>
-        <w:rPr>
-          <w:rFonts w:asciiTheme="minorHAnsi" w:hAnsiTheme="minorHAnsi" w:cstheme="minorHAnsi"/>
-          <w:b/>
+      <w:r>
+        <w:rPr>
+          <w:rFonts w:asciiTheme="minorHAnsi" w:hAnsiTheme="minorHAnsi" w:cstheme="minorHAnsi"/>
+        </w:rPr>
+        <w:t>, HTML, CSS</w:t>
+      </w:r>
+    </w:p>
+    <w:p>
+      <w:pPr>
+        <w:rPr>
+          <w:rFonts w:asciiTheme="minorHAnsi" w:hAnsiTheme="minorHAnsi" w:cstheme="minorHAnsi"/>
+        </w:rPr>
+      </w:pPr>
+      <w:r>
+        <w:rPr>
+          <w:rFonts w:asciiTheme="minorHAnsi" w:hAnsiTheme="minorHAnsi" w:cstheme="minorHAnsi"/>
+          <w:b/>
+          <w:bCs/>
+        </w:rPr>
+        <w:t>Libraries</w:t>
+      </w:r>
+      <w:r>
+        <w:rPr>
+          <w:rFonts w:asciiTheme="minorHAnsi" w:hAnsiTheme="minorHAnsi" w:cstheme="minorHAnsi"/>
+        </w:rPr>
+        <w:t>: TensorFlow, PyTorch, scikit-learn, statsmodels, SciPy, NumPy, pandas, umap, network</w:t>
+      </w:r>
+      <w:r>
+        <w:rPr>
+          <w:rFonts w:asciiTheme="minorHAnsi" w:hAnsiTheme="minorHAnsi" w:cstheme="minorHAnsi"/>
+        </w:rPr>
+        <w:t>x</w:t>
+      </w:r>
+      <w:r>
+        <w:rPr>
+          <w:rFonts w:asciiTheme="minorHAnsi" w:hAnsiTheme="minorHAnsi" w:cstheme="minorHAnsi"/>
+        </w:rPr>
+        <w:t>, KepplerMapper, Matplotlib, Seaborn</w:t>
+      </w:r>
+    </w:p>
+    <w:p>
+      <w:pPr>
+        <w:rPr>
+          <w:rFonts w:asciiTheme="minorHAnsi" w:hAnsiTheme="minorHAnsi" w:cstheme="minorHAnsi"/>
+        </w:rPr>
+      </w:pPr>
+      <w:r>
+        <w:rPr>
+          <w:rFonts w:asciiTheme="minorHAnsi" w:hAnsiTheme="minorHAnsi" w:cstheme="minorHAnsi"/>
+          <w:b/>
+        </w:rPr>
+        <w:t>Tools &amp; Techologies</w:t>
+      </w:r>
+      <w:r>
+        <w:rPr>
+          <w:rFonts w:asciiTheme="minorHAnsi" w:hAnsiTheme="minorHAnsi" w:cstheme="minorHAnsi"/>
+        </w:rPr>
+        <w:t xml:space="preserve">: </w:t>
+      </w:r>
+      <w:r>
+        <w:rPr>
+          <w:rFonts w:asciiTheme="minorHAnsi" w:hAnsiTheme="minorHAnsi" w:cstheme="minorHAnsi"/>
+        </w:rPr>
+        <w:t>Git, Apptainer, Docker, high-performance computing clusters, LaTeX</w:t>
+      </w:r>
+    </w:p>
+    <w:p>
+      <w:pPr>
+        <w:rPr>
+          <w:rFonts w:asciiTheme="minorHAnsi" w:hAnsiTheme="minorHAnsi" w:cstheme="minorHAnsi"/>
+        </w:rPr>
+      </w:pPr>
+      <w:r>
+        <w:rPr>
+          <w:rFonts w:asciiTheme="minorHAnsi" w:hAnsiTheme="minorHAnsi" w:cstheme="minorHAnsi"/>
+          <w:b/>
+          <w:bCs/>
         </w:rPr>
         <w:t>Applications</w:t>
       </w:r>
@@ -10187,19 +10347,13 @@
         <w:rPr>
           <w:rFonts w:asciiTheme="minorHAnsi" w:hAnsiTheme="minorHAnsi" w:cstheme="minorHAnsi"/>
         </w:rPr>
-        <w:t xml:space="preserve">FreeSurfer, </w:t>
-      </w:r>
-      <w:r>
-        <w:rPr>
-          <w:rFonts w:asciiTheme="minorHAnsi" w:hAnsiTheme="minorHAnsi" w:cstheme="minorHAnsi"/>
-        </w:rPr>
-        <w:t xml:space="preserve">EEGLAB, </w:t>
-      </w:r>
-      <w:r>
-        <w:rPr>
-          <w:rFonts w:asciiTheme="minorHAnsi" w:hAnsiTheme="minorHAnsi" w:cstheme="minorHAnsi"/>
-        </w:rPr>
-        <w:t>FSL, MRIcroGL, Slicer, ImageMagik, Surf Ice, Caret, SPSS, Motive, Unity, PupilLabs, Residence</w:t>
+        <w:t>FreeSurfer, FSL, EEGLAB, MRIcroGL, Surf Ice, Slicer, SPSS, JASP, REDCap, Qualtrics, Prolific, MTurk, Unity, Motive, Pupil Labs, ImageMagick, gimp, Inkscape, Microsoft Office, Prezi</w:t>
+      </w:r>
+      <w:r>
+        <w:rPr>
+          <w:rFonts w:asciiTheme="minorHAnsi" w:hAnsiTheme="minorHAnsi" w:cstheme="minorHAnsi"/>
+        </w:rPr>
+        <w:t>, Residence</w:t>
       </w:r>
     </w:p>
     <w:p>
@@ -10377,19 +10531,7 @@
         <w:rPr>
           <w:rFonts w:asciiTheme="minorHAnsi" w:hAnsiTheme="minorHAnsi" w:cstheme="minorHAnsi"/>
         </w:rPr>
-        <w:t>chinchilla care,</w:t>
-      </w:r>
-      <w:r>
-        <w:rPr>
-          <w:rFonts w:asciiTheme="minorHAnsi" w:hAnsiTheme="minorHAnsi" w:cstheme="minorHAnsi"/>
-        </w:rPr>
-        <w:t xml:space="preserve"> </w:t>
-      </w:r>
-      <w:r>
-        <w:rPr>
-          <w:rFonts w:asciiTheme="minorHAnsi" w:hAnsiTheme="minorHAnsi" w:cstheme="minorHAnsi"/>
-        </w:rPr>
-        <w:t>poetry</w:t>
+        <w:t>chinchilla care</w:t>
       </w:r>
     </w:p>
     <w:p>
@@ -10407,7 +10549,7 @@
       </w:pPr>
     </w:p>
     <w:sectPr>
-      <w:footerReference w:type="default" r:id="rId13"/>
+      <w:footerReference w:type="default" r:id="rId17"/>
       <w:pgSz w:w="12240" w:h="15840" w:code="1"/>
       <w:pgMar w:top="720" w:right="720" w:bottom="720" w:left="720" w:header="720" w:footer="720" w:gutter="0"/>
       <w:cols w:space="720"/>
@@ -10415,6 +10557,75 @@
     </w:sectPr>
   </w:body>
 </w:document>
+</file>
+
+<file path=word/comments.xml><?xml version="1.0" encoding="utf-8"?>
+<w:comments xmlns:wpc="http://schemas.microsoft.com/office/word/2010/wordprocessingCanvas" xmlns:cx="http://schemas.microsoft.com/office/drawing/2014/chartex" xmlns:cx1="http://schemas.microsoft.com/office/drawing/2015/9/8/chartex" xmlns:cx2="http://schemas.microsoft.com/office/drawing/2015/10/21/chartex" xmlns:cx3="http://schemas.microsoft.com/office/drawing/2016/5/9/chartex" xmlns:cx4="http://schemas.microsoft.com/office/drawing/2016/5/10/chartex" xmlns:cx5="http://schemas.microsoft.com/office/drawing/2016/5/11/chartex" xmlns:cx6="http://schemas.microsoft.com/office/drawing/2016/5/12/chartex" xmlns:cx7="http://schemas.microsoft.com/office/drawing/2016/5/13/chartex" xmlns:cx8="http://schemas.microsoft.com/office/drawing/2016/5/14/chartex" xmlns:mc="http://schemas.openxmlformats.org/markup-compatibility/2006" xmlns:aink="http://schemas.microsoft.com/office/drawing/2016/ink" xmlns:am3d="http://schemas.microsoft.com/office/drawing/2017/model3d" xmlns:o="urn:schemas-microsoft-com:office:office" xmlns:oel="http://schemas.microsoft.com/office/2019/extlst" xmlns:r="http://schemas.openxmlformats.org/officeDocument/2006/relationships" xmlns:m="http://schemas.openxmlformats.org/officeDocument/2006/math" xmlns:v="urn:schemas-microsoft-com:vml" xmlns:wp14="http://schemas.microsoft.com/office/word/2010/wordprocessingDrawing" xmlns:wp="http://schemas.openxmlformats.org/drawingml/2006/wordprocessingDrawing" xmlns:w10="urn:schemas-microsoft-com:office:word" xmlns:w="http://schemas.openxmlformats.org/wordprocessingml/2006/main" xmlns:w14="http://schemas.microsoft.com/office/word/2010/wordml" xmlns:w15="http://schemas.microsoft.com/office/word/2012/wordml" xmlns:w16cex="http://schemas.microsoft.com/office/word/2018/wordml/cex" xmlns:w16cid="http://schemas.microsoft.com/office/word/2016/wordml/cid" xmlns:w16="http://schemas.microsoft.com/office/word/2018/wordml" xmlns:w16du="http://schemas.microsoft.com/office/word/2023/wordml/word16du" xmlns:w16sdtdh="http://schemas.microsoft.com/office/word/2020/wordml/sdtdatahash" xmlns:w16sdtfl="http://schemas.microsoft.com/office/word/2024/wordml/sdtformatlock" xmlns:w16se="http://schemas.microsoft.com/office/word/2015/wordml/symex" xmlns:wpg="http://schemas.microsoft.com/office/word/2010/wordprocessingGroup" xmlns:wpi="http://schemas.microsoft.com/office/word/2010/wordprocessingInk" xmlns:wne="http://schemas.microsoft.com/office/word/2006/wordml" xmlns:wps="http://schemas.microsoft.com/office/word/2010/wordprocessingShape" mc:Ignorable="w14 w15 w16se w16cid w16 w16cex w16sdtdh w16sdtfl w16du wp14">
+  <w:comment w:id="0" w:author="Author" w:initials="A">
+    <w:p>
+      <w:pPr>
+        <w:pStyle w:val="CommentText"/>
+      </w:pPr>
+      <w:r>
+        <w:rPr>
+          <w:rStyle w:val="CommentReference"/>
+        </w:rPr>
+        <w:annotationRef/>
+      </w:r>
+      <w:r>
+        <w:t>How do I reflect change in funding starting Jan 1, or does this not matter?</w:t>
+      </w:r>
+    </w:p>
+  </w:comment>
+  <w:comment w:id="5" w:author="Author" w:initials="A">
+    <w:p>
+      <w:pPr>
+        <w:pStyle w:val="CommentText"/>
+      </w:pPr>
+      <w:r>
+        <w:rPr>
+          <w:rStyle w:val="CommentReference"/>
+        </w:rPr>
+        <w:annotationRef/>
+      </w:r>
+      <w:r>
+        <w:t>How should I note the presentaitons I’ve given for INSPIRE, your lab meeting, James’ lab meeting, Morning meeting, and boes lab meeting? Listing individually seems excessive but I want to accurately convey how much I’ve presented</w:t>
+      </w:r>
+    </w:p>
+  </w:comment>
+  <w:comment w:id="7" w:author="Author" w:initials="A">
+    <w:p>
+      <w:pPr>
+        <w:pStyle w:val="CommentText"/>
+      </w:pPr>
+      <w:r>
+        <w:rPr>
+          <w:rStyle w:val="CommentReference"/>
+        </w:rPr>
+        <w:annotationRef/>
+      </w:r>
+      <w:r>
+        <w:t>Should I start a new outreach section? Not sure where to put the spring lab fair or highlight times I’ve helped as a judge with things</w:t>
+      </w:r>
+    </w:p>
+  </w:comment>
+</w:comments>
+</file>
+
+<file path=word/commentsExtended.xml><?xml version="1.0" encoding="utf-8"?>
+<w15:commentsEx xmlns:wpc="http://schemas.microsoft.com/office/word/2010/wordprocessingCanvas" xmlns:cx="http://schemas.microsoft.com/office/drawing/2014/chartex" xmlns:cx1="http://schemas.microsoft.com/office/drawing/2015/9/8/chartex" xmlns:cx2="http://schemas.microsoft.com/office/drawing/2015/10/21/chartex" xmlns:cx3="http://schemas.microsoft.com/office/drawing/2016/5/9/chartex" xmlns:cx4="http://schemas.microsoft.com/office/drawing/2016/5/10/chartex" xmlns:cx5="http://schemas.microsoft.com/office/drawing/2016/5/11/chartex" xmlns:cx6="http://schemas.microsoft.com/office/drawing/2016/5/12/chartex" xmlns:cx7="http://schemas.microsoft.com/office/drawing/2016/5/13/chartex" xmlns:cx8="http://schemas.microsoft.com/office/drawing/2016/5/14/chartex" xmlns:mc="http://schemas.openxmlformats.org/markup-compatibility/2006" xmlns:aink="http://schemas.microsoft.com/office/drawing/2016/ink" xmlns:am3d="http://schemas.microsoft.com/office/drawing/2017/model3d" xmlns:o="urn:schemas-microsoft-com:office:office" xmlns:oel="http://schemas.microsoft.com/office/2019/extlst" xmlns:r="http://schemas.openxmlformats.org/officeDocument/2006/relationships" xmlns:m="http://schemas.openxmlformats.org/officeDocument/2006/math" xmlns:v="urn:schemas-microsoft-com:vml" xmlns:wp14="http://schemas.microsoft.com/office/word/2010/wordprocessingDrawing" xmlns:wp="http://schemas.openxmlformats.org/drawingml/2006/wordprocessingDrawing" xmlns:w10="urn:schemas-microsoft-com:office:word" xmlns:w="http://schemas.openxmlformats.org/wordprocessingml/2006/main" xmlns:w14="http://schemas.microsoft.com/office/word/2010/wordml" xmlns:w15="http://schemas.microsoft.com/office/word/2012/wordml" xmlns:w16cex="http://schemas.microsoft.com/office/word/2018/wordml/cex" xmlns:w16cid="http://schemas.microsoft.com/office/word/2016/wordml/cid" xmlns:w16="http://schemas.microsoft.com/office/word/2018/wordml" xmlns:w16du="http://schemas.microsoft.com/office/word/2023/wordml/word16du" xmlns:w16sdtdh="http://schemas.microsoft.com/office/word/2020/wordml/sdtdatahash" xmlns:w16sdtfl="http://schemas.microsoft.com/office/word/2024/wordml/sdtformatlock" xmlns:w16se="http://schemas.microsoft.com/office/word/2015/wordml/symex" xmlns:wpg="http://schemas.microsoft.com/office/word/2010/wordprocessingGroup" xmlns:wpi="http://schemas.microsoft.com/office/word/2010/wordprocessingInk" xmlns:wne="http://schemas.microsoft.com/office/word/2006/wordml" xmlns:wps="http://schemas.microsoft.com/office/word/2010/wordprocessingShape" mc:Ignorable="w14 w15 w16se w16cid w16 w16cex w16sdtdh w16sdtfl w16du wp14">
+  <w15:commentEx w15:paraId="47AD8633" w15:done="0"/>
+  <w15:commentEx w15:paraId="33CE687C" w15:done="0"/>
+  <w15:commentEx w15:paraId="47E01E7C" w15:done="0"/>
+</w15:commentsEx>
+</file>
+
+<file path=word/commentsIds.xml><?xml version="1.0" encoding="utf-8"?>
+<w16cid:commentsIds xmlns:wpc="http://schemas.microsoft.com/office/word/2010/wordprocessingCanvas" xmlns:cx="http://schemas.microsoft.com/office/drawing/2014/chartex" xmlns:cx1="http://schemas.microsoft.com/office/drawing/2015/9/8/chartex" xmlns:cx2="http://schemas.microsoft.com/office/drawing/2015/10/21/chartex" xmlns:cx3="http://schemas.microsoft.com/office/drawing/2016/5/9/chartex" xmlns:cx4="http://schemas.microsoft.com/office/drawing/2016/5/10/chartex" xmlns:cx5="http://schemas.microsoft.com/office/drawing/2016/5/11/chartex" xmlns:cx6="http://schemas.microsoft.com/office/drawing/2016/5/12/chartex" xmlns:cx7="http://schemas.microsoft.com/office/drawing/2016/5/13/chartex" xmlns:cx8="http://schemas.microsoft.com/office/drawing/2016/5/14/chartex" xmlns:mc="http://schemas.openxmlformats.org/markup-compatibility/2006" xmlns:aink="http://schemas.microsoft.com/office/drawing/2016/ink" xmlns:am3d="http://schemas.microsoft.com/office/drawing/2017/model3d" xmlns:o="urn:schemas-microsoft-com:office:office" xmlns:oel="http://schemas.microsoft.com/office/2019/extlst" xmlns:r="http://schemas.openxmlformats.org/officeDocument/2006/relationships" xmlns:m="http://schemas.openxmlformats.org/officeDocument/2006/math" xmlns:v="urn:schemas-microsoft-com:vml" xmlns:wp14="http://schemas.microsoft.com/office/word/2010/wordprocessingDrawing" xmlns:wp="http://schemas.openxmlformats.org/drawingml/2006/wordprocessingDrawing" xmlns:w10="urn:schemas-microsoft-com:office:word" xmlns:w="http://schemas.openxmlformats.org/wordprocessingml/2006/main" xmlns:w14="http://schemas.microsoft.com/office/word/2010/wordml" xmlns:w15="http://schemas.microsoft.com/office/word/2012/wordml" xmlns:w16cex="http://schemas.microsoft.com/office/word/2018/wordml/cex" xmlns:w16cid="http://schemas.microsoft.com/office/word/2016/wordml/cid" xmlns:w16="http://schemas.microsoft.com/office/word/2018/wordml" xmlns:w16du="http://schemas.microsoft.com/office/word/2023/wordml/word16du" xmlns:w16sdtdh="http://schemas.microsoft.com/office/word/2020/wordml/sdtdatahash" xmlns:w16sdtfl="http://schemas.microsoft.com/office/word/2024/wordml/sdtformatlock" xmlns:w16se="http://schemas.microsoft.com/office/word/2015/wordml/symex" xmlns:wpg="http://schemas.microsoft.com/office/word/2010/wordprocessingGroup" xmlns:wpi="http://schemas.microsoft.com/office/word/2010/wordprocessingInk" xmlns:wne="http://schemas.microsoft.com/office/word/2006/wordml" xmlns:wps="http://schemas.microsoft.com/office/word/2010/wordprocessingShape" mc:Ignorable="w14 w15 w16se w16cid w16 w16cex w16sdtdh w16sdtfl w16du wp14">
+  <w16cid:commentId w16cid:paraId="47AD8633" w16cid:durableId="7977BDCC"/>
+  <w16cid:commentId w16cid:paraId="33CE687C" w16cid:durableId="329D7079"/>
+  <w16cid:commentId w16cid:paraId="47E01E7C" w16cid:durableId="42B2FFDC"/>
+</w16cid:commentsIds>
 </file>
 
 <file path=word/endnotes.xml><?xml version="1.0" encoding="utf-8"?>
@@ -12537,6 +12748,58 @@
       <w:szCs w:val="28"/>
     </w:rPr>
   </w:style>
+  <w:style w:type="character" w:styleId="CommentReference">
+    <w:name w:val="annotation reference"/>
+    <w:basedOn w:val="DefaultParagraphFont"/>
+    <w:semiHidden/>
+    <w:unhideWhenUsed/>
+    <w:rsid w:val="007275DE"/>
+    <w:rPr>
+      <w:sz w:val="16"/>
+      <w:szCs w:val="16"/>
+    </w:rPr>
+  </w:style>
+  <w:style w:type="paragraph" w:styleId="CommentText">
+    <w:name w:val="annotation text"/>
+    <w:basedOn w:val="Normal"/>
+    <w:link w:val="CommentTextChar"/>
+    <w:unhideWhenUsed/>
+    <w:rsid w:val="007275DE"/>
+    <w:rPr>
+      <w:sz w:val="20"/>
+      <w:szCs w:val="20"/>
+    </w:rPr>
+  </w:style>
+  <w:style w:type="character" w:customStyle="1" w:styleId="CommentTextChar">
+    <w:name w:val="Comment Text Char"/>
+    <w:basedOn w:val="DefaultParagraphFont"/>
+    <w:link w:val="CommentText"/>
+    <w:rsid w:val="007275DE"/>
+  </w:style>
+  <w:style w:type="paragraph" w:styleId="CommentSubject">
+    <w:name w:val="annotation subject"/>
+    <w:basedOn w:val="CommentText"/>
+    <w:next w:val="CommentText"/>
+    <w:link w:val="CommentSubjectChar"/>
+    <w:semiHidden/>
+    <w:unhideWhenUsed/>
+    <w:rsid w:val="007275DE"/>
+    <w:rPr>
+      <w:b/>
+      <w:bCs/>
+    </w:rPr>
+  </w:style>
+  <w:style w:type="character" w:customStyle="1" w:styleId="CommentSubjectChar">
+    <w:name w:val="Comment Subject Char"/>
+    <w:basedOn w:val="CommentTextChar"/>
+    <w:link w:val="CommentSubject"/>
+    <w:semiHidden/>
+    <w:rsid w:val="007275DE"/>
+    <w:rPr>
+      <w:b/>
+      <w:bCs/>
+    </w:rPr>
+  </w:style>
 </w:styles>
 </file>
 
@@ -12766,6 +13029,14 @@
 </file>
 
 <file path=customXml/item1.xml><?xml version="1.0" encoding="utf-8"?>
+<p:properties xmlns:p="http://schemas.microsoft.com/office/2006/metadata/properties" xmlns:xsi="http://www.w3.org/2001/XMLSchema-instance" xmlns:pc="http://schemas.microsoft.com/office/infopath/2007/PartnerControls">
+  <documentManagement>
+    <_activity xmlns="126773f3-138a-4932-9430-374550db2cb2" xsi:nil="true"/>
+  </documentManagement>
+</p:properties>
+</file>
+
+<file path=customXml/item2.xml><?xml version="1.0" encoding="utf-8"?>
 <?mso-contentType ?>
 <FormTemplates xmlns="http://schemas.microsoft.com/sharepoint/v3/contenttype/forms">
   <Display>DocumentLibraryForm</Display>
@@ -12774,15 +13045,11 @@
 </FormTemplates>
 </file>
 
-<file path=customXml/item2.xml><?xml version="1.0" encoding="utf-8"?>
-<p:properties xmlns:p="http://schemas.microsoft.com/office/2006/metadata/properties" xmlns:xsi="http://www.w3.org/2001/XMLSchema-instance" xmlns:pc="http://schemas.microsoft.com/office/infopath/2007/PartnerControls">
-  <documentManagement>
-    <_activity xmlns="126773f3-138a-4932-9430-374550db2cb2" xsi:nil="true"/>
-  </documentManagement>
-</p:properties>
+<file path=customXml/item3.xml><?xml version="1.0" encoding="utf-8"?>
+<b:Sources xmlns:b="http://schemas.openxmlformats.org/officeDocument/2006/bibliography" xmlns="http://schemas.openxmlformats.org/officeDocument/2006/bibliography" SelectedStyle="\APASixthEditionOfficeOnline.xsl" StyleName="APA" Version="6"/>
 </file>
 
-<file path=customXml/item3.xml><?xml version="1.0" encoding="utf-8"?>
+<file path=customXml/item4.xml><?xml version="1.0" encoding="utf-8"?>
 <ct:contentTypeSchema xmlns:ct="http://schemas.microsoft.com/office/2006/metadata/contentType" xmlns:ma="http://schemas.microsoft.com/office/2006/metadata/properties/metaAttributes" ct:_="" ma:_="" ma:contentTypeName="Document" ma:contentTypeID="0x010100065ECE431C49C641835331F8F155C927" ma:contentTypeVersion="16" ma:contentTypeDescription="Create a new document." ma:contentTypeScope="" ma:versionID="a458ca00dd538dfd14839c00925cc203">
   <xsd:schema xmlns:xsd="http://www.w3.org/2001/XMLSchema" xmlns:xs="http://www.w3.org/2001/XMLSchema" xmlns:p="http://schemas.microsoft.com/office/2006/metadata/properties" xmlns:ns3="126773f3-138a-4932-9430-374550db2cb2" xmlns:ns4="3f22499f-c798-421c-afe5-20f39e819821" targetNamespace="http://schemas.microsoft.com/office/2006/metadata/properties" ma:root="true" ma:fieldsID="c42917808d563e620dbc646f2d18325f" ns3:_="" ns4:_="">
     <xsd:import namespace="126773f3-138a-4932-9430-374550db2cb2"/>
@@ -13023,19 +13290,7 @@
 </ct:contentTypeSchema>
 </file>
 
-<file path=customXml/item4.xml><?xml version="1.0" encoding="utf-8"?>
-<b:Sources xmlns:b="http://schemas.openxmlformats.org/officeDocument/2006/bibliography" xmlns="http://schemas.openxmlformats.org/officeDocument/2006/bibliography" SelectedStyle="\APASixthEditionOfficeOnline.xsl" StyleName="APA" Version="6"/>
-</file>
-
 <file path=customXml/itemProps1.xml><?xml version="1.0" encoding="utf-8"?>
-<ds:datastoreItem xmlns:ds="http://schemas.openxmlformats.org/officeDocument/2006/customXml" ds:itemID="{D080C629-E267-44F6-96AA-5DEAA65C9A5E}">
-  <ds:schemaRefs>
-    <ds:schemaRef ds:uri="http://schemas.microsoft.com/sharepoint/v3/contenttype/forms"/>
-  </ds:schemaRefs>
-</ds:datastoreItem>
-</file>
-
-<file path=customXml/itemProps2.xml><?xml version="1.0" encoding="utf-8"?>
 <ds:datastoreItem xmlns:ds="http://schemas.openxmlformats.org/officeDocument/2006/customXml" ds:itemID="{62856C32-A384-4490-917E-9A0492FA7C8B}">
   <ds:schemaRefs>
     <ds:schemaRef ds:uri="http://schemas.microsoft.com/office/2006/metadata/properties"/>
@@ -13045,7 +13300,23 @@
 </ds:datastoreItem>
 </file>
 
+<file path=customXml/itemProps2.xml><?xml version="1.0" encoding="utf-8"?>
+<ds:datastoreItem xmlns:ds="http://schemas.openxmlformats.org/officeDocument/2006/customXml" ds:itemID="{D080C629-E267-44F6-96AA-5DEAA65C9A5E}">
+  <ds:schemaRefs>
+    <ds:schemaRef ds:uri="http://schemas.microsoft.com/sharepoint/v3/contenttype/forms"/>
+  </ds:schemaRefs>
+</ds:datastoreItem>
+</file>
+
 <file path=customXml/itemProps3.xml><?xml version="1.0" encoding="utf-8"?>
+<ds:datastoreItem xmlns:ds="http://schemas.openxmlformats.org/officeDocument/2006/customXml" ds:itemID="{B7D3A8C9-7754-4C67-AB02-99C4DF722DBE}">
+  <ds:schemaRefs>
+    <ds:schemaRef ds:uri="http://schemas.openxmlformats.org/officeDocument/2006/bibliography"/>
+  </ds:schemaRefs>
+</ds:datastoreItem>
+</file>
+
+<file path=customXml/itemProps4.xml><?xml version="1.0" encoding="utf-8"?>
 <ds:datastoreItem xmlns:ds="http://schemas.openxmlformats.org/officeDocument/2006/customXml" ds:itemID="{A225CDAD-9A03-465F-9FD9-EA1C0010CC94}">
   <ds:schemaRefs>
     <ds:schemaRef ds:uri="http://schemas.microsoft.com/office/2006/metadata/contentType"/>
@@ -13062,12 +13333,4 @@
     <ds:schemaRef ds:uri="http://schemas.microsoft.com/internal/obd"/>
   </ds:schemaRefs>
 </ds:datastoreItem>
-</file>
-
-<file path=customXml/itemProps4.xml><?xml version="1.0" encoding="utf-8"?>
-<ds:datastoreItem xmlns:ds="http://schemas.openxmlformats.org/officeDocument/2006/customXml" ds:itemID="{B7D3A8C9-7754-4C67-AB02-99C4DF722DBE}">
-  <ds:schemaRefs>
-    <ds:schemaRef ds:uri="http://schemas.openxmlformats.org/officeDocument/2006/bibliography"/>
-  </ds:schemaRefs>
-</ds:datastoreItem>
 </file>
</xml_diff>